<commit_message>
Add png, update index / README.md
</commit_message>
<xml_diff>
--- a/assets/resume-kwon-sangheon.docx
+++ b/assets/resume-kwon-sangheon.docx
@@ -25,12 +25,6 @@
         <w:gridCol w:w="8846"/>
       </w:tblGrid>
       <w:tr>
-        <w:tblPrEx>
-          <w:tblCellMar>
-            <w:top w:w="0" w:type="dxa"/>
-            <w:bottom w:w="0" w:type="dxa"/>
-          </w:tblCellMar>
-        </w:tblPrEx>
         <w:trPr>
           <w:trHeight w:val="16585"/>
         </w:trPr>
@@ -67,7 +61,7 @@
           </w:p>
           <w:p>
             <w:pPr>
-              <w:spacing w:before="8" w:line="320" w:after="8" w:lineRule="exact"/>
+              <w:spacing w:before="8" w:after="8" w:line="320" w:lineRule="exact"/>
             </w:pPr>
             <w:r>
               <w:rPr>
@@ -123,7 +117,7 @@
           </w:p>
           <w:p>
             <w:pPr>
-              <w:spacing w:before="94" w:line="300" w:after="14" w:lineRule="exact"/>
+              <w:spacing w:before="94" w:after="14" w:line="300" w:lineRule="exact"/>
             </w:pPr>
             <w:r>
               <w:rPr>
@@ -136,7 +130,7 @@
           </w:p>
           <w:p>
             <w:pPr>
-              <w:spacing w:before="14" w:line="300" w:after="14" w:lineRule="exact"/>
+              <w:spacing w:before="14" w:after="14" w:line="300" w:lineRule="exact"/>
             </w:pPr>
             <w:r>
               <w:rPr>
@@ -149,7 +143,7 @@
           </w:p>
           <w:p>
             <w:pPr>
-              <w:spacing w:before="94" w:line="300" w:after="14" w:lineRule="exact"/>
+              <w:spacing w:before="94" w:after="14" w:line="300" w:lineRule="exact"/>
             </w:pPr>
             <w:r>
               <w:rPr>
@@ -162,7 +156,7 @@
           </w:p>
           <w:p>
             <w:pPr>
-              <w:spacing w:before="14" w:line="300" w:after="14" w:lineRule="exact"/>
+              <w:spacing w:before="14" w:after="14" w:line="300" w:lineRule="exact"/>
             </w:pPr>
             <w:r>
               <w:rPr>
@@ -175,7 +169,7 @@
           </w:p>
           <w:p>
             <w:pPr>
-              <w:spacing w:before="94" w:line="300" w:after="14" w:lineRule="exact"/>
+              <w:spacing w:before="94" w:after="14" w:line="300" w:lineRule="exact"/>
             </w:pPr>
             <w:r>
               <w:rPr>
@@ -188,7 +182,7 @@
           </w:p>
           <w:p>
             <w:pPr>
-              <w:spacing w:before="14" w:line="300" w:after="14" w:lineRule="exact"/>
+              <w:spacing w:before="14" w:after="14" w:line="300" w:lineRule="exact"/>
             </w:pPr>
             <w:r>
               <w:rPr>
@@ -201,7 +195,7 @@
           </w:p>
           <w:p>
             <w:pPr>
-              <w:spacing w:before="94" w:line="300" w:after="14" w:lineRule="exact"/>
+              <w:spacing w:before="94" w:after="14" w:line="300" w:lineRule="exact"/>
             </w:pPr>
             <w:r>
               <w:rPr>
@@ -214,7 +208,7 @@
           </w:p>
           <w:p>
             <w:pPr>
-              <w:spacing w:before="14" w:line="300" w:after="14" w:lineRule="exact"/>
+              <w:spacing w:before="14" w:after="14" w:line="300" w:lineRule="exact"/>
             </w:pPr>
             <w:r>
               <w:rPr>
@@ -227,7 +221,7 @@
           </w:p>
           <w:p>
             <w:pPr>
-              <w:spacing w:before="14" w:line="300" w:after="14" w:lineRule="exact"/>
+              <w:spacing w:before="14" w:after="14" w:line="300" w:lineRule="exact"/>
             </w:pPr>
             <w:r>
               <w:rPr>
@@ -240,8 +234,9 @@
           </w:p>
           <w:p>
             <w:pPr>
-              <w:spacing w:before="94" w:line="300" w:after="14" w:lineRule="exact"/>
-            </w:pPr>
+              <w:spacing w:before="94" w:after="14" w:line="300" w:lineRule="exact"/>
+            </w:pPr>
+            <w:proofErr w:type="spellStart"/>
             <w:r>
               <w:rPr>
                 <w:b/>
@@ -250,10 +245,11 @@
               </w:rPr>
               <w:t>Github</w:t>
             </w:r>
-          </w:p>
-          <w:p>
-            <w:pPr>
-              <w:spacing w:before="14" w:line="300" w:after="14" w:lineRule="exact"/>
+            <w:proofErr w:type="spellEnd"/>
+          </w:p>
+          <w:p>
+            <w:pPr>
+              <w:spacing w:before="14" w:after="14" w:line="300" w:lineRule="exact"/>
             </w:pPr>
             <w:r>
               <w:rPr>
@@ -261,8 +257,18 @@
                 <w:sz w:val="18"/>
                 <w:szCs w:val="18"/>
               </w:rPr>
-              <w:t>github.com/kwsahe</w:t>
-            </w:r>
+              <w:t>github.com/</w:t>
+            </w:r>
+            <w:proofErr w:type="spellStart"/>
+            <w:r>
+              <w:rPr>
+                <w:color w:val="80B8D8"/>
+                <w:sz w:val="18"/>
+                <w:szCs w:val="18"/>
+              </w:rPr>
+              <w:t>kwsahe</w:t>
+            </w:r>
+            <w:proofErr w:type="spellEnd"/>
           </w:p>
           <w:p>
             <w:pPr>
@@ -289,7 +295,7 @@
           </w:p>
           <w:p>
             <w:pPr>
-              <w:spacing w:before="94" w:line="300" w:after="14" w:lineRule="exact"/>
+              <w:spacing w:before="94" w:after="14" w:line="300" w:lineRule="exact"/>
             </w:pPr>
             <w:proofErr w:type="gramStart"/>
             <w:r>
@@ -312,7 +318,7 @@
           </w:p>
           <w:p>
             <w:pPr>
-              <w:spacing w:before="14" w:line="300" w:after="14" w:lineRule="exact"/>
+              <w:spacing w:before="14" w:after="14" w:line="300" w:lineRule="exact"/>
             </w:pPr>
             <w:r>
               <w:rPr>
@@ -325,7 +331,7 @@
           </w:p>
           <w:p>
             <w:pPr>
-              <w:spacing w:before="14" w:line="300" w:after="14" w:lineRule="exact"/>
+              <w:spacing w:before="14" w:after="14" w:line="300" w:lineRule="exact"/>
             </w:pPr>
             <w:r>
               <w:rPr>
@@ -338,7 +344,7 @@
           </w:p>
           <w:p>
             <w:pPr>
-              <w:spacing w:before="14" w:line="300" w:after="14" w:lineRule="exact"/>
+              <w:spacing w:before="14" w:after="14" w:line="300" w:lineRule="exact"/>
             </w:pPr>
             <w:r>
               <w:rPr>
@@ -351,7 +357,7 @@
           </w:p>
           <w:p>
             <w:pPr>
-              <w:spacing w:before="14" w:line="300" w:after="14" w:lineRule="exact"/>
+              <w:spacing w:before="14" w:after="14" w:line="300" w:lineRule="exact"/>
             </w:pPr>
             <w:r>
               <w:rPr>
@@ -364,7 +370,7 @@
           </w:p>
           <w:p>
             <w:pPr>
-              <w:spacing w:before="94" w:line="300" w:after="14" w:lineRule="exact"/>
+              <w:spacing w:before="94" w:after="14" w:line="300" w:lineRule="exact"/>
             </w:pPr>
             <w:r>
               <w:rPr>
@@ -377,7 +383,7 @@
           </w:p>
           <w:p>
             <w:pPr>
-              <w:spacing w:before="14" w:line="300" w:after="14" w:lineRule="exact"/>
+              <w:spacing w:before="14" w:after="14" w:line="300" w:lineRule="exact"/>
             </w:pPr>
             <w:r>
               <w:rPr>
@@ -385,25 +391,43 @@
                 <w:sz w:val="18"/>
                 <w:szCs w:val="18"/>
               </w:rPr>
-              <w:t>• 머신러닝 기초</w:t>
-            </w:r>
-          </w:p>
-          <w:p>
-            <w:pPr>
-              <w:spacing w:before="14" w:line="300" w:after="14" w:lineRule="exact"/>
-            </w:pPr>
+              <w:t xml:space="preserve">• </w:t>
+            </w:r>
+            <w:proofErr w:type="spellStart"/>
             <w:r>
               <w:rPr>
                 <w:color w:val="C5D8E8"/>
                 <w:sz w:val="18"/>
                 <w:szCs w:val="18"/>
               </w:rPr>
+              <w:t>머신러닝</w:t>
+            </w:r>
+            <w:proofErr w:type="spellEnd"/>
+            <w:r>
+              <w:rPr>
+                <w:color w:val="C5D8E8"/>
+                <w:sz w:val="18"/>
+                <w:szCs w:val="18"/>
+              </w:rPr>
+              <w:t xml:space="preserve"> 기초</w:t>
+            </w:r>
+          </w:p>
+          <w:p>
+            <w:pPr>
+              <w:spacing w:before="14" w:after="14" w:line="300" w:lineRule="exact"/>
+            </w:pPr>
+            <w:r>
+              <w:rPr>
+                <w:color w:val="C5D8E8"/>
+                <w:sz w:val="18"/>
+                <w:szCs w:val="18"/>
+              </w:rPr>
               <w:t>• RAG / 생성형 AI</w:t>
             </w:r>
           </w:p>
           <w:p>
             <w:pPr>
-              <w:spacing w:before="14" w:line="300" w:after="14" w:lineRule="exact"/>
+              <w:spacing w:before="14" w:after="14" w:line="300" w:lineRule="exact"/>
             </w:pPr>
             <w:r>
               <w:rPr>
@@ -416,7 +440,7 @@
           </w:p>
           <w:p>
             <w:pPr>
-              <w:spacing w:before="14" w:line="300" w:after="14" w:lineRule="exact"/>
+              <w:spacing w:before="14" w:after="14" w:line="300" w:lineRule="exact"/>
             </w:pPr>
             <w:r>
               <w:rPr>
@@ -429,7 +453,7 @@
           </w:p>
           <w:p>
             <w:pPr>
-              <w:spacing w:before="94" w:line="300" w:after="14" w:lineRule="exact"/>
+              <w:spacing w:before="94" w:after="14" w:line="300" w:lineRule="exact"/>
             </w:pPr>
             <w:proofErr w:type="gramStart"/>
             <w:r>
@@ -452,7 +476,7 @@
           </w:p>
           <w:p>
             <w:pPr>
-              <w:spacing w:before="14" w:line="300" w:after="14" w:lineRule="exact"/>
+              <w:spacing w:before="14" w:after="14" w:line="300" w:lineRule="exact"/>
             </w:pPr>
             <w:r>
               <w:rPr>
@@ -465,7 +489,7 @@
           </w:p>
           <w:p>
             <w:pPr>
-              <w:spacing w:before="14" w:line="300" w:after="14" w:lineRule="exact"/>
+              <w:spacing w:before="14" w:after="14" w:line="300" w:lineRule="exact"/>
             </w:pPr>
             <w:r>
               <w:rPr>
@@ -478,7 +502,7 @@
           </w:p>
           <w:p>
             <w:pPr>
-              <w:spacing w:before="14" w:line="300" w:after="14" w:lineRule="exact"/>
+              <w:spacing w:before="14" w:after="14" w:line="300" w:lineRule="exact"/>
             </w:pPr>
             <w:r>
               <w:rPr>
@@ -510,29 +534,19 @@
           <w:tbl>
             <w:tblPr>
               <w:tblW w:w="8126" w:type="dxa"/>
-              <w:tblBorders>
-                <w:top w:val="none" w:sz="0" w:space="0" w:color="auto"/>
-                <w:left w:val="none" w:sz="0" w:space="0" w:color="auto"/>
-                <w:bottom w:val="none" w:sz="0" w:space="0" w:color="auto"/>
-                <w:right w:val="none" w:sz="0" w:space="0" w:color="auto"/>
-                <w:insideH w:val="none" w:sz="0" w:space="0" w:color="auto"/>
-                <w:insideV w:val="none" w:sz="0" w:space="0" w:color="auto"/>
-              </w:tblBorders>
+              <w:tblLook w:val="04A0" w:firstRow="1" w:lastRow="0" w:firstColumn="1" w:lastColumn="0" w:noHBand="0" w:noVBand="1"/>
             </w:tblPr>
             <w:tblGrid>
               <w:gridCol w:w="6626"/>
               <w:gridCol w:w="1500"/>
             </w:tblGrid>
             <w:tr>
+              <w:trPr>
+                <w:trHeight w:val="1256"/>
+              </w:trPr>
               <w:tc>
                 <w:tcPr>
                   <w:tcW w:w="6626" w:type="dxa"/>
-                  <w:tcBorders>
-                    <w:top w:val="none" w:sz="0" w:space="0" w:color="auto"/>
-                    <w:left w:val="none" w:sz="0" w:space="0" w:color="auto"/>
-                    <w:bottom w:val="none" w:sz="0" w:space="0" w:color="auto"/>
-                    <w:right w:val="none" w:sz="0" w:space="0" w:color="auto"/>
-                  </w:tcBorders>
                   <w:tcMar>
                     <w:top w:w="0" w:type="dxa"/>
                     <w:left w:w="0" w:type="dxa"/>
@@ -573,16 +587,72 @@
                 </w:tcPr>
                 <w:p>
                   <w:pPr>
-                    <w:jc w:val="center"/>
-                    <w:spacing w:before="0" w:line="300" w:after="0" w:lineRule="exact"/>
+                    <w:spacing w:line="300" w:lineRule="exact"/>
+                    <w:rPr>
+                      <w:rFonts w:hint="eastAsia"/>
+                    </w:rPr>
                   </w:pPr>
                   <w:r>
                     <w:rPr>
-                      <w:color w:val="BBBBBB"/>
-                      <w:sz w:val="18"/>
-                      <w:szCs w:val="18"/>
-                    </w:rPr>
-                    <w:t>사  진</w:t>
+                      <w:noProof/>
+                    </w:rPr>
+                    <w:drawing>
+                      <wp:anchor distT="0" distB="0" distL="114300" distR="114300" simplePos="0" relativeHeight="251658240" behindDoc="0" locked="0" layoutInCell="1" allowOverlap="1" wp14:anchorId="0457FDE2" wp14:editId="00B6B9DA">
+                        <wp:simplePos x="0" y="0"/>
+                        <wp:positionH relativeFrom="column">
+                          <wp:posOffset>207010</wp:posOffset>
+                        </wp:positionH>
+                        <wp:positionV relativeFrom="paragraph">
+                          <wp:posOffset>-666750</wp:posOffset>
+                        </wp:positionV>
+                        <wp:extent cx="556260" cy="664210"/>
+                        <wp:effectExtent l="0" t="0" r="0" b="2540"/>
+                        <wp:wrapTopAndBottom/>
+                        <wp:docPr id="101" name="증명사진" descr="증명사진"/>
+                        <wp:cNvGraphicFramePr>
+                          <a:graphicFrameLocks xmlns:a="http://schemas.openxmlformats.org/drawingml/2006/main" noChangeAspect="1"/>
+                        </wp:cNvGraphicFramePr>
+                        <a:graphic xmlns:a="http://schemas.openxmlformats.org/drawingml/2006/main">
+                          <a:graphicData uri="http://schemas.openxmlformats.org/drawingml/2006/picture">
+                            <pic:pic xmlns:pic="http://schemas.openxmlformats.org/drawingml/2006/picture">
+                              <pic:nvPicPr>
+                                <pic:cNvPr id="101" name="증명사진"/>
+                                <pic:cNvPicPr>
+                                  <a:picLocks noChangeAspect="1"/>
+                                </pic:cNvPicPr>
+                              </pic:nvPicPr>
+                              <pic:blipFill>
+                                <a:blip r:embed="rId5" cstate="print">
+                                  <a:extLst>
+                                    <a:ext uri="{28A0092B-C50C-407E-A947-70E740481C1C}">
+                                      <a14:useLocalDpi xmlns:a14="http://schemas.microsoft.com/office/drawing/2010/main" val="0"/>
+                                    </a:ext>
+                                  </a:extLst>
+                                </a:blip>
+                                <a:stretch>
+                                  <a:fillRect/>
+                                </a:stretch>
+                              </pic:blipFill>
+                              <pic:spPr>
+                                <a:xfrm>
+                                  <a:off x="0" y="0"/>
+                                  <a:ext cx="556260" cy="664210"/>
+                                </a:xfrm>
+                                <a:prstGeom prst="rect">
+                                  <a:avLst/>
+                                </a:prstGeom>
+                              </pic:spPr>
+                            </pic:pic>
+                          </a:graphicData>
+                        </a:graphic>
+                        <wp14:sizeRelH relativeFrom="margin">
+                          <wp14:pctWidth>0</wp14:pctWidth>
+                        </wp14:sizeRelH>
+                        <wp14:sizeRelV relativeFrom="margin">
+                          <wp14:pctHeight>0</wp14:pctHeight>
+                        </wp14:sizeRelV>
+                      </wp:anchor>
+                    </w:drawing>
                   </w:r>
                 </w:p>
               </w:tc>
@@ -590,7 +660,7 @@
           </w:tbl>
           <w:p>
             <w:pPr>
-              <w:spacing w:before="8" w:line="320" w:after="8" w:lineRule="exact"/>
+              <w:spacing w:before="8" w:after="8" w:line="320" w:lineRule="exact"/>
             </w:pPr>
             <w:r>
               <w:t xml:space="preserve"> </w:t>
@@ -609,7 +679,7 @@
               <w:pBdr>
                 <w:bottom w:val="single" w:sz="6" w:space="3" w:color="C8973A"/>
               </w:pBdr>
-              <w:spacing w:before="324" w:line="360" w:after="68" w:lineRule="exact"/>
+              <w:spacing w:before="324" w:after="68" w:line="360" w:lineRule="exact"/>
             </w:pPr>
             <w:r>
               <w:rPr>
@@ -630,7 +700,49 @@
               <w:rPr>
                 <w:color w:val="333333"/>
               </w:rPr>
-              <w:t>서강대학교 미디어공학과를 졸업하고 빅데이터분석기사, 네트워크관리사 2급 등 데이터·IT 관련 자격증을 보유하고 있습니다. 데이타트렌드에서 AI 바우처 사업수행계획서 작성 및 AI 사업전략 업무를 수행하며 실무 경험을 쌓았으며, 서울대학교 데이터사이언스 부트캠프를 통해 이론적 기반을 강화하였습니다. 현재 매력일자리 개발자 과정을 이수 중이며, Python과 SQL을 중심으로 데이터 파이프라인 구축 및 AI 서비스 개발 역량을 키우는 동시에, 최신 AI 기술 트렌드, 영상 처리, RAG 등 실무에 바로 적용 가능한 기술들을 폭넓게 학습하고 있습니다.</w:t>
+              <w:t xml:space="preserve">서강대학교 미디어공학과를 졸업하고 </w:t>
+            </w:r>
+            <w:proofErr w:type="spellStart"/>
+            <w:r>
+              <w:rPr>
+                <w:color w:val="333333"/>
+              </w:rPr>
+              <w:t>빅데이터분석기사</w:t>
+            </w:r>
+            <w:proofErr w:type="spellEnd"/>
+            <w:r>
+              <w:rPr>
+                <w:color w:val="333333"/>
+              </w:rPr>
+              <w:t xml:space="preserve">, 네트워크관리사 2급 등 데이터·IT 관련 자격증을 보유하고 있습니다. </w:t>
+            </w:r>
+            <w:proofErr w:type="spellStart"/>
+            <w:r>
+              <w:rPr>
+                <w:color w:val="333333"/>
+              </w:rPr>
+              <w:t>데이타트렌드에서</w:t>
+            </w:r>
+            <w:proofErr w:type="spellEnd"/>
+            <w:r>
+              <w:rPr>
+                <w:color w:val="333333"/>
+              </w:rPr>
+              <w:t xml:space="preserve"> AI 바우처 사업수행계획서 작성 및 AI 사업전략 업무를 수행하며 실무 경험을 쌓았으며, 서울대학교 </w:t>
+            </w:r>
+            <w:proofErr w:type="spellStart"/>
+            <w:r>
+              <w:rPr>
+                <w:color w:val="333333"/>
+              </w:rPr>
+              <w:t>데이터사이언스</w:t>
+            </w:r>
+            <w:proofErr w:type="spellEnd"/>
+            <w:r>
+              <w:rPr>
+                <w:color w:val="333333"/>
+              </w:rPr>
+              <w:t xml:space="preserve"> 부트캠프를 통해 이론적 기반을 강화하였습니다. 현재 매력일자리 개발자 과정을 이수 중이며, Python과 SQL을 중심으로 데이터 파이프라인 구축 및 AI 서비스 개발 역량을 키우는 동시에, 최신 AI 기술 트렌드, 영상 처리, RAG 등 실무에 바로 적용 가능한 기술들을 폭넓게 학습하고 있습니다.</w:t>
             </w:r>
           </w:p>
           <w:p>
@@ -638,7 +750,7 @@
               <w:pBdr>
                 <w:bottom w:val="single" w:sz="6" w:space="3" w:color="C8973A"/>
               </w:pBdr>
-              <w:spacing w:before="324" w:line="360" w:after="68" w:lineRule="exact"/>
+              <w:spacing w:before="324" w:after="68" w:line="360" w:lineRule="exact"/>
             </w:pPr>
             <w:r>
               <w:rPr>
@@ -673,12 +785,6 @@
               <w:gridCol w:w="2500"/>
             </w:tblGrid>
             <w:tr>
-              <w:tblPrEx>
-                <w:tblCellMar>
-                  <w:top w:w="0" w:type="dxa"/>
-                  <w:bottom w:w="0" w:type="dxa"/>
-                </w:tblCellMar>
-              </w:tblPrEx>
               <w:tc>
                 <w:tcPr>
                   <w:tcW w:w="5626" w:type="dxa"/>
@@ -699,6 +805,7 @@
                   <w:pPr>
                     <w:spacing w:line="300" w:lineRule="exact"/>
                   </w:pPr>
+                  <w:proofErr w:type="spellStart"/>
                   <w:proofErr w:type="gramStart"/>
                   <w:r>
                     <w:rPr>
@@ -710,6 +817,7 @@
                     </w:rPr>
                     <w:t>데이타트렌드</w:t>
                   </w:r>
+                  <w:proofErr w:type="spellEnd"/>
                   <w:r>
                     <w:rPr>
                       <w:color w:val="333333"/>
@@ -787,7 +895,7 @@
                 <w:ilvl w:val="0"/>
                 <w:numId w:val="2"/>
               </w:numPr>
-              <w:spacing w:before="16" w:line="300" w:after="16" w:lineRule="exact"/>
+              <w:spacing w:before="16" w:after="16" w:line="300" w:lineRule="exact"/>
             </w:pPr>
             <w:r>
               <w:rPr>
@@ -805,7 +913,7 @@
                 <w:ilvl w:val="0"/>
                 <w:numId w:val="2"/>
               </w:numPr>
-              <w:spacing w:before="16" w:line="300" w:after="16" w:lineRule="exact"/>
+              <w:spacing w:before="16" w:after="16" w:line="300" w:lineRule="exact"/>
             </w:pPr>
             <w:r>
               <w:rPr>
@@ -823,7 +931,7 @@
                 <w:ilvl w:val="0"/>
                 <w:numId w:val="2"/>
               </w:numPr>
-              <w:spacing w:before="16" w:line="300" w:after="16" w:lineRule="exact"/>
+              <w:spacing w:before="16" w:after="16" w:line="300" w:lineRule="exact"/>
             </w:pPr>
             <w:r>
               <w:rPr>
@@ -844,7 +952,7 @@
               <w:pBdr>
                 <w:bottom w:val="single" w:sz="6" w:space="3" w:color="C8973A"/>
               </w:pBdr>
-              <w:spacing w:before="324" w:line="360" w:after="68" w:lineRule="exact"/>
+              <w:spacing w:before="324" w:after="68" w:line="360" w:lineRule="exact"/>
             </w:pPr>
             <w:r>
               <w:rPr>
@@ -879,12 +987,6 @@
               <w:gridCol w:w="2500"/>
             </w:tblGrid>
             <w:tr>
-              <w:tblPrEx>
-                <w:tblCellMar>
-                  <w:top w:w="0" w:type="dxa"/>
-                  <w:bottom w:w="0" w:type="dxa"/>
-                </w:tblCellMar>
-              </w:tblPrEx>
               <w:tc>
                 <w:tcPr>
                   <w:tcW w:w="5626" w:type="dxa"/>
@@ -1011,7 +1113,7 @@
                 <w:ilvl w:val="0"/>
                 <w:numId w:val="2"/>
               </w:numPr>
-              <w:spacing w:before="16" w:line="300" w:after="16" w:lineRule="exact"/>
+              <w:spacing w:before="16" w:after="16" w:line="300" w:lineRule="exact"/>
             </w:pPr>
             <w:r>
               <w:rPr>
@@ -1049,12 +1151,6 @@
               <w:gridCol w:w="2500"/>
             </w:tblGrid>
             <w:tr>
-              <w:tblPrEx>
-                <w:tblCellMar>
-                  <w:top w:w="0" w:type="dxa"/>
-                  <w:bottom w:w="0" w:type="dxa"/>
-                </w:tblCellMar>
-              </w:tblPrEx>
               <w:tc>
                 <w:tcPr>
                   <w:tcW w:w="5626" w:type="dxa"/>
@@ -1083,7 +1179,29 @@
                       <w:sz w:val="22"/>
                       <w:szCs w:val="22"/>
                     </w:rPr>
-                    <w:t>서울대학교 데이터사이언스 부트캠프</w:t>
+                    <w:t xml:space="preserve">서울대학교 </w:t>
+                  </w:r>
+                  <w:proofErr w:type="spellStart"/>
+                  <w:r>
+                    <w:rPr>
+                      <w:b/>
+                      <w:bCs/>
+                      <w:color w:val="1A1A1A"/>
+                      <w:sz w:val="22"/>
+                      <w:szCs w:val="22"/>
+                    </w:rPr>
+                    <w:t>데이터사이언스</w:t>
+                  </w:r>
+                  <w:proofErr w:type="spellEnd"/>
+                  <w:r>
+                    <w:rPr>
+                      <w:b/>
+                      <w:bCs/>
+                      <w:color w:val="1A1A1A"/>
+                      <w:sz w:val="22"/>
+                      <w:szCs w:val="22"/>
+                    </w:rPr>
+                    <w:t xml:space="preserve"> 부트캠프</w:t>
                   </w:r>
                 </w:p>
               </w:tc>
@@ -1137,15 +1255,25 @@
                 <w:ilvl w:val="0"/>
                 <w:numId w:val="2"/>
               </w:numPr>
-              <w:spacing w:before="16" w:line="300" w:after="16" w:lineRule="exact"/>
-            </w:pPr>
-            <w:r>
-              <w:rPr>
-                <w:color w:val="333333"/>
-                <w:sz w:val="18"/>
-                <w:szCs w:val="18"/>
-              </w:rPr>
-              <w:t>데이터사이언스를 위한 선형대수학 및 확률과 통계</w:t>
+              <w:spacing w:before="16" w:after="16" w:line="300" w:lineRule="exact"/>
+            </w:pPr>
+            <w:proofErr w:type="spellStart"/>
+            <w:r>
+              <w:rPr>
+                <w:color w:val="333333"/>
+                <w:sz w:val="18"/>
+                <w:szCs w:val="18"/>
+              </w:rPr>
+              <w:t>데이터사이언스를</w:t>
+            </w:r>
+            <w:proofErr w:type="spellEnd"/>
+            <w:r>
+              <w:rPr>
+                <w:color w:val="333333"/>
+                <w:sz w:val="18"/>
+                <w:szCs w:val="18"/>
+              </w:rPr>
+              <w:t xml:space="preserve"> 위한 선형대수학 및 확률과 통계</w:t>
             </w:r>
           </w:p>
           <w:p>
@@ -1155,15 +1283,25 @@
                 <w:ilvl w:val="0"/>
                 <w:numId w:val="2"/>
               </w:numPr>
-              <w:spacing w:before="16" w:line="300" w:after="16" w:lineRule="exact"/>
-            </w:pPr>
-            <w:r>
-              <w:rPr>
-                <w:color w:val="333333"/>
-                <w:sz w:val="18"/>
-                <w:szCs w:val="18"/>
-              </w:rPr>
-              <w:t>머신러닝 기초 이론 및 실습</w:t>
+              <w:spacing w:before="16" w:after="16" w:line="300" w:lineRule="exact"/>
+            </w:pPr>
+            <w:proofErr w:type="spellStart"/>
+            <w:r>
+              <w:rPr>
+                <w:color w:val="333333"/>
+                <w:sz w:val="18"/>
+                <w:szCs w:val="18"/>
+              </w:rPr>
+              <w:t>머신러닝</w:t>
+            </w:r>
+            <w:proofErr w:type="spellEnd"/>
+            <w:r>
+              <w:rPr>
+                <w:color w:val="333333"/>
+                <w:sz w:val="18"/>
+                <w:szCs w:val="18"/>
+              </w:rPr>
+              <w:t xml:space="preserve"> 기초 이론 및 실습</w:t>
             </w:r>
           </w:p>
           <w:p>
@@ -1193,12 +1331,6 @@
               <w:gridCol w:w="2500"/>
             </w:tblGrid>
             <w:tr>
-              <w:tblPrEx>
-                <w:tblCellMar>
-                  <w:top w:w="0" w:type="dxa"/>
-                  <w:bottom w:w="0" w:type="dxa"/>
-                </w:tblCellMar>
-              </w:tblPrEx>
               <w:tc>
                 <w:tcPr>
                   <w:tcW w:w="5626" w:type="dxa"/>
@@ -1299,7 +1431,7 @@
                 <w:ilvl w:val="0"/>
                 <w:numId w:val="2"/>
               </w:numPr>
-              <w:spacing w:before="16" w:line="300" w:after="16" w:lineRule="exact"/>
+              <w:spacing w:before="16" w:after="16" w:line="300" w:lineRule="exact"/>
             </w:pPr>
             <w:r>
               <w:rPr>
@@ -1317,15 +1449,33 @@
                 <w:ilvl w:val="0"/>
                 <w:numId w:val="2"/>
               </w:numPr>
-              <w:spacing w:before="16" w:line="300" w:after="16" w:lineRule="exact"/>
-            </w:pPr>
-            <w:r>
-              <w:rPr>
-                <w:color w:val="333333"/>
-                <w:sz w:val="18"/>
-                <w:szCs w:val="18"/>
-              </w:rPr>
-              <w:t>Python 기반 백엔드 개발 및 데이터 파이프라인 구축</w:t>
+              <w:spacing w:before="16" w:after="16" w:line="300" w:lineRule="exact"/>
+            </w:pPr>
+            <w:r>
+              <w:rPr>
+                <w:color w:val="333333"/>
+                <w:sz w:val="18"/>
+                <w:szCs w:val="18"/>
+              </w:rPr>
+              <w:t xml:space="preserve">Python 기반 </w:t>
+            </w:r>
+            <w:proofErr w:type="spellStart"/>
+            <w:r>
+              <w:rPr>
+                <w:color w:val="333333"/>
+                <w:sz w:val="18"/>
+                <w:szCs w:val="18"/>
+              </w:rPr>
+              <w:t>백엔드</w:t>
+            </w:r>
+            <w:proofErr w:type="spellEnd"/>
+            <w:r>
+              <w:rPr>
+                <w:color w:val="333333"/>
+                <w:sz w:val="18"/>
+                <w:szCs w:val="18"/>
+              </w:rPr>
+              <w:t xml:space="preserve"> 개발 및 데이터 파이프라인 구축</w:t>
             </w:r>
           </w:p>
           <w:p>
@@ -1335,7 +1485,7 @@
                 <w:ilvl w:val="0"/>
                 <w:numId w:val="2"/>
               </w:numPr>
-              <w:spacing w:before="16" w:line="300" w:after="16" w:lineRule="exact"/>
+              <w:spacing w:before="16" w:after="16" w:line="300" w:lineRule="exact"/>
             </w:pPr>
             <w:r>
               <w:rPr>
@@ -1356,10 +1506,7 @@
     </w:tbl>
     <w:p>
       <w:pPr>
-        <w:spacing w:before="0" w:after="0" w:line="20" w:lineRule="exact"/>
-        <w:rPr>
-          <w:rFonts w:hint="eastAsia"/>
-        </w:rPr>
+        <w:spacing w:line="20" w:lineRule="exact"/>
         <w:sectPr>
           <w:pgSz w:w="11906" w:h="16838"/>
           <w:pgMar w:top="0" w:right="0" w:bottom="0" w:left="0" w:header="708" w:footer="708" w:gutter="0"/>
@@ -1390,12 +1537,6 @@
         <w:gridCol w:w="8846"/>
       </w:tblGrid>
       <w:tr>
-        <w:tblPrEx>
-          <w:tblCellMar>
-            <w:top w:w="0" w:type="dxa"/>
-            <w:bottom w:w="0" w:type="dxa"/>
-          </w:tblCellMar>
-        </w:tblPrEx>
         <w:trPr>
           <w:trHeight w:val="16160"/>
         </w:trPr>
@@ -1453,8 +1594,9 @@
           </w:p>
           <w:p>
             <w:pPr>
-              <w:spacing w:before="68" w:line="300" w:after="6" w:lineRule="exact"/>
-            </w:pPr>
+              <w:spacing w:before="68" w:after="6" w:line="300" w:lineRule="exact"/>
+            </w:pPr>
+            <w:proofErr w:type="spellStart"/>
             <w:r>
               <w:rPr>
                 <w:b/>
@@ -1463,23 +1605,34 @@
               </w:rPr>
               <w:t>빅데이터분석기사</w:t>
             </w:r>
-          </w:p>
-          <w:p>
-            <w:pPr>
-              <w:spacing w:line="300" w:after="54" w:lineRule="exact"/>
-            </w:pPr>
+            <w:proofErr w:type="spellEnd"/>
+          </w:p>
+          <w:p>
+            <w:pPr>
+              <w:spacing w:after="54" w:line="300" w:lineRule="exact"/>
+            </w:pPr>
+            <w:proofErr w:type="spellStart"/>
             <w:r>
               <w:rPr>
                 <w:color w:val="999999"/>
                 <w:sz w:val="16"/>
                 <w:szCs w:val="16"/>
               </w:rPr>
-              <w:t>한국데이터산업진흥원 · 2025.12</w:t>
-            </w:r>
-          </w:p>
-          <w:p>
-            <w:pPr>
-              <w:spacing w:before="68" w:line="300" w:after="6" w:lineRule="exact"/>
+              <w:t>한국데이터산업진흥원</w:t>
+            </w:r>
+            <w:proofErr w:type="spellEnd"/>
+            <w:r>
+              <w:rPr>
+                <w:color w:val="999999"/>
+                <w:sz w:val="16"/>
+                <w:szCs w:val="16"/>
+              </w:rPr>
+              <w:t xml:space="preserve"> · 2025.12</w:t>
+            </w:r>
+          </w:p>
+          <w:p>
+            <w:pPr>
+              <w:spacing w:before="68" w:after="6" w:line="300" w:lineRule="exact"/>
             </w:pPr>
             <w:r>
               <w:rPr>
@@ -1492,7 +1645,7 @@
           </w:p>
           <w:p>
             <w:pPr>
-              <w:spacing w:line="300" w:after="54" w:lineRule="exact"/>
+              <w:spacing w:after="54" w:line="300" w:lineRule="exact"/>
             </w:pPr>
             <w:r>
               <w:rPr>
@@ -1505,7 +1658,7 @@
           </w:p>
           <w:p>
             <w:pPr>
-              <w:spacing w:before="68" w:line="300" w:after="6" w:lineRule="exact"/>
+              <w:spacing w:before="68" w:after="6" w:line="300" w:lineRule="exact"/>
             </w:pPr>
             <w:r>
               <w:rPr>
@@ -1518,7 +1671,7 @@
           </w:p>
           <w:p>
             <w:pPr>
-              <w:spacing w:line="300" w:after="54" w:lineRule="exact"/>
+              <w:spacing w:after="54" w:line="300" w:lineRule="exact"/>
             </w:pPr>
             <w:r>
               <w:rPr>
@@ -1554,7 +1707,7 @@
           </w:p>
           <w:p>
             <w:pPr>
-              <w:spacing w:before="94" w:line="300" w:after="14" w:lineRule="exact"/>
+              <w:spacing w:before="94" w:after="14" w:line="300" w:lineRule="exact"/>
             </w:pPr>
             <w:r>
               <w:rPr>
@@ -1567,7 +1720,7 @@
           </w:p>
           <w:p>
             <w:pPr>
-              <w:spacing w:before="14" w:line="300" w:after="14" w:lineRule="exact"/>
+              <w:spacing w:before="14" w:after="14" w:line="300" w:lineRule="exact"/>
             </w:pPr>
             <w:proofErr w:type="gramStart"/>
             <w:r>
@@ -1608,7 +1761,7 @@
           </w:p>
           <w:p>
             <w:pPr>
-              <w:spacing w:before="94" w:line="300" w:after="14" w:lineRule="exact"/>
+              <w:spacing w:before="94" w:after="14" w:line="300" w:lineRule="exact"/>
             </w:pPr>
             <w:r>
               <w:rPr>
@@ -1621,7 +1774,7 @@
           </w:p>
           <w:p>
             <w:pPr>
-              <w:spacing w:before="14" w:line="300" w:after="14" w:lineRule="exact"/>
+              <w:spacing w:before="14" w:after="14" w:line="300" w:lineRule="exact"/>
             </w:pPr>
             <w:r>
               <w:rPr>
@@ -1629,12 +1782,22 @@
                 <w:sz w:val="18"/>
                 <w:szCs w:val="18"/>
               </w:rPr>
-              <w:t>서울 · 경기 전지역</w:t>
-            </w:r>
-          </w:p>
-          <w:p>
-            <w:pPr>
-              <w:spacing w:before="94" w:line="300" w:after="14" w:lineRule="exact"/>
+              <w:t xml:space="preserve">서울 · 경기 </w:t>
+            </w:r>
+            <w:proofErr w:type="spellStart"/>
+            <w:r>
+              <w:rPr>
+                <w:color w:val="C5D8E8"/>
+                <w:sz w:val="18"/>
+                <w:szCs w:val="18"/>
+              </w:rPr>
+              <w:t>전지역</w:t>
+            </w:r>
+            <w:proofErr w:type="spellEnd"/>
+          </w:p>
+          <w:p>
+            <w:pPr>
+              <w:spacing w:before="94" w:after="14" w:line="300" w:lineRule="exact"/>
             </w:pPr>
             <w:r>
               <w:rPr>
@@ -1647,8 +1810,9 @@
           </w:p>
           <w:p>
             <w:pPr>
-              <w:spacing w:before="14" w:line="300" w:after="14" w:lineRule="exact"/>
-            </w:pPr>
+              <w:spacing w:before="14" w:after="14" w:line="300" w:lineRule="exact"/>
+            </w:pPr>
+            <w:proofErr w:type="spellStart"/>
             <w:proofErr w:type="gramStart"/>
             <w:r>
               <w:rPr>
@@ -1656,7 +1820,16 @@
                 <w:sz w:val="18"/>
                 <w:szCs w:val="18"/>
               </w:rPr>
-              <w:t>데이터엔지니어 /</w:t>
+              <w:t>데이터엔지니어</w:t>
+            </w:r>
+            <w:proofErr w:type="spellEnd"/>
+            <w:r>
+              <w:rPr>
+                <w:color w:val="C5D8E8"/>
+                <w:sz w:val="18"/>
+                <w:szCs w:val="18"/>
+              </w:rPr>
+              <w:t xml:space="preserve"> /</w:t>
             </w:r>
             <w:proofErr w:type="gramEnd"/>
             <w:r>
@@ -1670,7 +1843,7 @@
           </w:p>
           <w:p>
             <w:pPr>
-              <w:spacing w:before="94" w:line="300" w:after="14" w:lineRule="exact"/>
+              <w:spacing w:before="94" w:after="14" w:line="300" w:lineRule="exact"/>
             </w:pPr>
             <w:r>
               <w:rPr>
@@ -1683,7 +1856,7 @@
           </w:p>
           <w:p>
             <w:pPr>
-              <w:spacing w:before="14" w:line="300" w:after="14" w:lineRule="exact"/>
+              <w:spacing w:before="14" w:after="14" w:line="300" w:lineRule="exact"/>
             </w:pPr>
             <w:r>
               <w:rPr>
@@ -1719,7 +1892,7 @@
           </w:p>
           <w:p>
             <w:pPr>
-              <w:spacing w:before="94" w:line="300" w:after="14" w:lineRule="exact"/>
+              <w:spacing w:before="94" w:after="14" w:line="300" w:lineRule="exact"/>
             </w:pPr>
             <w:r>
               <w:rPr>
@@ -1732,7 +1905,7 @@
           </w:p>
           <w:p>
             <w:pPr>
-              <w:spacing w:before="14" w:line="300" w:after="14" w:lineRule="exact"/>
+              <w:spacing w:before="14" w:after="14" w:line="300" w:lineRule="exact"/>
             </w:pPr>
             <w:r>
               <w:rPr>
@@ -1745,7 +1918,7 @@
           </w:p>
           <w:p>
             <w:pPr>
-              <w:spacing w:before="94" w:line="300" w:after="14" w:lineRule="exact"/>
+              <w:spacing w:before="94" w:after="14" w:line="300" w:lineRule="exact"/>
             </w:pPr>
             <w:r>
               <w:rPr>
@@ -1758,7 +1931,7 @@
           </w:p>
           <w:p>
             <w:pPr>
-              <w:spacing w:before="14" w:line="300" w:after="14" w:lineRule="exact"/>
+              <w:spacing w:before="14" w:after="14" w:line="300" w:lineRule="exact"/>
             </w:pPr>
             <w:r>
               <w:rPr>
@@ -1771,7 +1944,7 @@
           </w:p>
           <w:p>
             <w:pPr>
-              <w:spacing w:before="94" w:line="300" w:after="14" w:lineRule="exact"/>
+              <w:spacing w:before="94" w:after="14" w:line="300" w:lineRule="exact"/>
             </w:pPr>
             <w:r>
               <w:rPr>
@@ -1784,7 +1957,7 @@
           </w:p>
           <w:p>
             <w:pPr>
-              <w:spacing w:before="14" w:line="300" w:after="14" w:lineRule="exact"/>
+              <w:spacing w:before="14" w:after="14" w:line="300" w:lineRule="exact"/>
             </w:pPr>
             <w:r>
               <w:rPr>
@@ -1830,7 +2003,7 @@
               <w:pBdr>
                 <w:bottom w:val="single" w:sz="6" w:space="3" w:color="C8973A"/>
               </w:pBdr>
-              <w:spacing w:before="324" w:line="360" w:after="68" w:lineRule="exact"/>
+              <w:spacing w:before="324" w:after="68" w:line="360" w:lineRule="exact"/>
             </w:pPr>
             <w:r>
               <w:rPr>
@@ -1865,12 +2038,6 @@
               <w:gridCol w:w="4063"/>
             </w:tblGrid>
             <w:tr>
-              <w:tblPrEx>
-                <w:tblCellMar>
-                  <w:top w:w="0" w:type="dxa"/>
-                  <w:bottom w:w="0" w:type="dxa"/>
-                </w:tblCellMar>
-              </w:tblPrEx>
               <w:tc>
                 <w:tcPr>
                   <w:tcW w:w="4063" w:type="dxa"/>
@@ -1891,6 +2058,7 @@
                   <w:pPr>
                     <w:spacing w:line="300" w:lineRule="exact"/>
                   </w:pPr>
+                  <w:proofErr w:type="spellStart"/>
                   <w:r>
                     <w:rPr>
                       <w:b/>
@@ -1900,6 +2068,91 @@
                       <w:szCs w:val="22"/>
                     </w:rPr>
                     <w:t>빅데이터분석기사</w:t>
+                  </w:r>
+                  <w:proofErr w:type="spellEnd"/>
+                </w:p>
+              </w:tc>
+              <w:tc>
+                <w:tcPr>
+                  <w:tcW w:w="4063" w:type="dxa"/>
+                  <w:tcBorders>
+                    <w:top w:val="none" w:sz="0" w:space="0" w:color="FFFFFF"/>
+                    <w:left w:val="none" w:sz="0" w:space="0" w:color="FFFFFF"/>
+                    <w:bottom w:val="none" w:sz="0" w:space="0" w:color="FFFFFF"/>
+                    <w:right w:val="none" w:sz="0" w:space="0" w:color="FFFFFF"/>
+                  </w:tcBorders>
+                  <w:tcMar>
+                    <w:top w:w="36" w:type="dxa"/>
+                    <w:left w:w="20" w:type="dxa"/>
+                    <w:bottom w:w="36" w:type="dxa"/>
+                    <w:right w:w="0" w:type="dxa"/>
+                  </w:tcMar>
+                </w:tcPr>
+                <w:p>
+                  <w:pPr>
+                    <w:spacing w:line="300" w:lineRule="exact"/>
+                  </w:pPr>
+                  <w:proofErr w:type="spellStart"/>
+                  <w:proofErr w:type="gramStart"/>
+                  <w:r>
+                    <w:rPr>
+                      <w:color w:val="666666"/>
+                      <w:sz w:val="18"/>
+                      <w:szCs w:val="18"/>
+                    </w:rPr>
+                    <w:t>한국데이터산업진흥원</w:t>
+                  </w:r>
+                  <w:proofErr w:type="spellEnd"/>
+                  <w:r>
+                    <w:rPr>
+                      <w:color w:val="666666"/>
+                      <w:sz w:val="18"/>
+                      <w:szCs w:val="18"/>
+                    </w:rPr>
+                    <w:t xml:space="preserve">  ·</w:t>
+                  </w:r>
+                  <w:proofErr w:type="gramEnd"/>
+                  <w:r>
+                    <w:rPr>
+                      <w:color w:val="666666"/>
+                      <w:sz w:val="18"/>
+                      <w:szCs w:val="18"/>
+                    </w:rPr>
+                    <w:t xml:space="preserve">  2025. 12</w:t>
+                  </w:r>
+                </w:p>
+              </w:tc>
+            </w:tr>
+            <w:tr>
+              <w:tc>
+                <w:tcPr>
+                  <w:tcW w:w="4063" w:type="dxa"/>
+                  <w:tcBorders>
+                    <w:top w:val="none" w:sz="0" w:space="0" w:color="FFFFFF"/>
+                    <w:left w:val="none" w:sz="0" w:space="0" w:color="FFFFFF"/>
+                    <w:bottom w:val="none" w:sz="0" w:space="0" w:color="FFFFFF"/>
+                    <w:right w:val="none" w:sz="0" w:space="0" w:color="FFFFFF"/>
+                  </w:tcBorders>
+                  <w:tcMar>
+                    <w:top w:w="36" w:type="dxa"/>
+                    <w:left w:w="0" w:type="dxa"/>
+                    <w:bottom w:w="36" w:type="dxa"/>
+                    <w:right w:w="20" w:type="dxa"/>
+                  </w:tcMar>
+                </w:tcPr>
+                <w:p>
+                  <w:pPr>
+                    <w:spacing w:line="300" w:lineRule="exact"/>
+                  </w:pPr>
+                  <w:r>
+                    <w:rPr>
+                      <w:b/>
+                      <w:bCs/>
+                      <w:color w:val="1A1A1A"/>
+                      <w:sz w:val="22"/>
+                      <w:szCs w:val="22"/>
+                    </w:rPr>
+                    <w:t>AI-POT (AI프롬프트활용능력) 2급</w:t>
                   </w:r>
                 </w:p>
               </w:tc>
@@ -1930,7 +2183,7 @@
                       <w:sz w:val="18"/>
                       <w:szCs w:val="18"/>
                     </w:rPr>
-                    <w:t>한국데이터산업진흥원  ·</w:t>
+                    <w:t>한국생산성본부  ·</w:t>
                   </w:r>
                   <w:proofErr w:type="gramEnd"/>
                   <w:r>
@@ -1939,18 +2192,12 @@
                       <w:sz w:val="18"/>
                       <w:szCs w:val="18"/>
                     </w:rPr>
-                    <w:t xml:space="preserve">  2025. 12</w:t>
+                    <w:t xml:space="preserve">  2024. 11</w:t>
                   </w:r>
                 </w:p>
               </w:tc>
             </w:tr>
             <w:tr>
-              <w:tblPrEx>
-                <w:tblCellMar>
-                  <w:top w:w="0" w:type="dxa"/>
-                  <w:bottom w:w="0" w:type="dxa"/>
-                </w:tblCellMar>
-              </w:tblPrEx>
               <w:tc>
                 <w:tcPr>
                   <w:tcW w:w="4063" w:type="dxa"/>
@@ -1979,7 +2226,7 @@
                       <w:sz w:val="22"/>
                       <w:szCs w:val="22"/>
                     </w:rPr>
-                    <w:t>AI-POT (AI프롬프트활용능력) 2급</w:t>
+                    <w:t>네트워크관리사 2급</w:t>
                   </w:r>
                 </w:p>
               </w:tc>
@@ -2010,86 +2257,6 @@
                       <w:sz w:val="18"/>
                       <w:szCs w:val="18"/>
                     </w:rPr>
-                    <w:t>한국생산성본부  ·</w:t>
-                  </w:r>
-                  <w:proofErr w:type="gramEnd"/>
-                  <w:r>
-                    <w:rPr>
-                      <w:color w:val="666666"/>
-                      <w:sz w:val="18"/>
-                      <w:szCs w:val="18"/>
-                    </w:rPr>
-                    <w:t xml:space="preserve">  2024. 11</w:t>
-                  </w:r>
-                </w:p>
-              </w:tc>
-            </w:tr>
-            <w:tr>
-              <w:tblPrEx>
-                <w:tblCellMar>
-                  <w:top w:w="0" w:type="dxa"/>
-                  <w:bottom w:w="0" w:type="dxa"/>
-                </w:tblCellMar>
-              </w:tblPrEx>
-              <w:tc>
-                <w:tcPr>
-                  <w:tcW w:w="4063" w:type="dxa"/>
-                  <w:tcBorders>
-                    <w:top w:val="none" w:sz="0" w:space="0" w:color="FFFFFF"/>
-                    <w:left w:val="none" w:sz="0" w:space="0" w:color="FFFFFF"/>
-                    <w:bottom w:val="none" w:sz="0" w:space="0" w:color="FFFFFF"/>
-                    <w:right w:val="none" w:sz="0" w:space="0" w:color="FFFFFF"/>
-                  </w:tcBorders>
-                  <w:tcMar>
-                    <w:top w:w="36" w:type="dxa"/>
-                    <w:left w:w="0" w:type="dxa"/>
-                    <w:bottom w:w="36" w:type="dxa"/>
-                    <w:right w:w="20" w:type="dxa"/>
-                  </w:tcMar>
-                </w:tcPr>
-                <w:p>
-                  <w:pPr>
-                    <w:spacing w:line="300" w:lineRule="exact"/>
-                  </w:pPr>
-                  <w:r>
-                    <w:rPr>
-                      <w:b/>
-                      <w:bCs/>
-                      <w:color w:val="1A1A1A"/>
-                      <w:sz w:val="22"/>
-                      <w:szCs w:val="22"/>
-                    </w:rPr>
-                    <w:t>네트워크관리사 2급</w:t>
-                  </w:r>
-                </w:p>
-              </w:tc>
-              <w:tc>
-                <w:tcPr>
-                  <w:tcW w:w="4063" w:type="dxa"/>
-                  <w:tcBorders>
-                    <w:top w:val="none" w:sz="0" w:space="0" w:color="FFFFFF"/>
-                    <w:left w:val="none" w:sz="0" w:space="0" w:color="FFFFFF"/>
-                    <w:bottom w:val="none" w:sz="0" w:space="0" w:color="FFFFFF"/>
-                    <w:right w:val="none" w:sz="0" w:space="0" w:color="FFFFFF"/>
-                  </w:tcBorders>
-                  <w:tcMar>
-                    <w:top w:w="36" w:type="dxa"/>
-                    <w:left w:w="20" w:type="dxa"/>
-                    <w:bottom w:w="36" w:type="dxa"/>
-                    <w:right w:w="0" w:type="dxa"/>
-                  </w:tcMar>
-                </w:tcPr>
-                <w:p>
-                  <w:pPr>
-                    <w:spacing w:line="300" w:lineRule="exact"/>
-                  </w:pPr>
-                  <w:proofErr w:type="gramStart"/>
-                  <w:r>
-                    <w:rPr>
-                      <w:color w:val="666666"/>
-                      <w:sz w:val="18"/>
-                      <w:szCs w:val="18"/>
-                    </w:rPr>
                     <w:t>한국정보통신자격협회  ·</w:t>
                   </w:r>
                   <w:proofErr w:type="gramEnd"/>
@@ -2110,7 +2277,7 @@
               <w:pBdr>
                 <w:bottom w:val="single" w:sz="6" w:space="3" w:color="C8973A"/>
               </w:pBdr>
-              <w:spacing w:before="351" w:line="360" w:after="68" w:lineRule="exact"/>
+              <w:spacing w:before="351" w:after="68" w:line="360" w:lineRule="exact"/>
             </w:pPr>
             <w:r>
               <w:rPr>
@@ -2131,13 +2298,9 @@
                 <w:left w:val="none" w:sz="0" w:space="0" w:color="FFFFFF"/>
                 <w:bottom w:val="none" w:sz="0" w:space="0" w:color="FFFFFF"/>
                 <w:right w:val="none" w:sz="0" w:space="0" w:color="FFFFFF"/>
-                <w:insideH w:val="single" w:sz="4" w:space="0" w:color="auto"/>
-                <w:insideV w:val="single" w:sz="4" w:space="0" w:color="auto"/>
+                <w:insideH w:val="none" w:sz="0" w:space="0" w:color="FFFFFF"/>
+                <w:insideV w:val="none" w:sz="0" w:space="0" w:color="FFFFFF"/>
               </w:tblBorders>
-              <w:tblCellMar>
-                <w:left w:w="10" w:type="dxa"/>
-                <w:right w:w="10" w:type="dxa"/>
-              </w:tblCellMar>
               <w:tblLook w:val="04A0" w:firstRow="1" w:lastRow="0" w:firstColumn="1" w:lastColumn="0" w:noHBand="0" w:noVBand="1"/>
             </w:tblPr>
             <w:tblGrid>
@@ -2145,12 +2308,6 @@
               <w:gridCol w:w="2500"/>
             </w:tblGrid>
             <w:tr>
-              <w:tblPrEx>
-                <w:tblCellMar>
-                  <w:top w:w="0" w:type="dxa"/>
-                  <w:bottom w:w="0" w:type="dxa"/>
-                </w:tblCellMar>
-              </w:tblPrEx>
               <w:tc>
                 <w:tcPr>
                   <w:tcW w:w="5626" w:type="dxa"/>
@@ -2179,18 +2336,7 @@
                       <w:sz w:val="22"/>
                       <w:szCs w:val="22"/>
                     </w:rPr>
-                    <w:t>ecommerce-data-analysis-</w:t>
-                  </w:r>
-                  <w:proofErr w:type="gramStart"/>
-                  <w:r>
-                    <w:rPr>
-                      <w:b/>
-                      <w:bCs/>
-                      <w:color w:val="1A1A1A"/>
-                      <w:sz w:val="22"/>
-                      <w:szCs w:val="22"/>
-                    </w:rPr>
-                    <w:t>practice</w:t>
+                    <w:t>rag-report</w:t>
                   </w:r>
                   <w:r>
                     <w:rPr>
@@ -2198,16 +2344,7 @@
                       <w:sz w:val="18"/>
                       <w:szCs w:val="18"/>
                     </w:rPr>
-                    <w:t xml:space="preserve">  |</w:t>
-                  </w:r>
-                  <w:proofErr w:type="gramEnd"/>
-                  <w:r>
-                    <w:rPr>
-                      <w:color w:val="333333"/>
-                      <w:sz w:val="18"/>
-                      <w:szCs w:val="18"/>
-                    </w:rPr>
-                    <w:t xml:space="preserve">  23일 자체 설계</w:t>
+                    <w:t xml:space="preserve">  |  산업안전보건법 위반 판단 시스템</w:t>
                   </w:r>
                 </w:p>
               </w:tc>
@@ -2238,7 +2375,7 @@
                       <w:sz w:val="16"/>
                       <w:szCs w:val="16"/>
                     </w:rPr>
-                    <w:t>Jupyter Notebook</w:t>
+                    <w:t>Python · RAG</w:t>
                   </w:r>
                 </w:p>
               </w:tc>
@@ -2251,15 +2388,15 @@
                 <w:ilvl w:val="0"/>
                 <w:numId w:val="2"/>
               </w:numPr>
-              <w:spacing w:before="16" w:line="300" w:after="16" w:lineRule="exact"/>
-            </w:pPr>
-            <w:r>
-              <w:rPr>
-                <w:color w:val="333333"/>
-                <w:sz w:val="18"/>
-                <w:szCs w:val="18"/>
-              </w:rPr>
-              <w:t>SQL · RFM 분석 · 머신러닝 · 시계열 예측 · SQLD까지 엔드투엔드 직접 설계 및 수행</w:t>
+              <w:spacing w:before="16" w:after="16" w:line="300" w:lineRule="exact"/>
+            </w:pPr>
+            <w:r>
+              <w:rPr>
+                <w:color w:val="333333"/>
+                <w:sz w:val="18"/>
+                <w:szCs w:val="18"/>
+              </w:rPr>
+              <w:t>건설현장 사고 시나리오 → 산업안전보건법 PDF 검색 → LLM 위반 조항 판단 RAG 시스템</w:t>
             </w:r>
           </w:p>
           <w:p>
@@ -2269,15 +2406,79 @@
                 <w:ilvl w:val="0"/>
                 <w:numId w:val="2"/>
               </w:numPr>
-              <w:spacing w:before="16" w:line="300" w:after="16" w:lineRule="exact"/>
-            </w:pPr>
-            <w:r>
-              <w:rPr>
-                <w:color w:val="333333"/>
-                <w:sz w:val="18"/>
-                <w:szCs w:val="18"/>
-              </w:rPr>
-              <w:t>실무 수준의 이커머스 데이터 분석 파이프라인 구축</w:t>
+              <w:spacing w:before="16" w:after="16" w:line="300" w:lineRule="exact"/>
+            </w:pPr>
+            <w:proofErr w:type="spellStart"/>
+            <w:r>
+              <w:rPr>
+                <w:color w:val="333333"/>
+                <w:sz w:val="18"/>
+                <w:szCs w:val="18"/>
+              </w:rPr>
+              <w:t>pdfplumber</w:t>
+            </w:r>
+            <w:proofErr w:type="spellEnd"/>
+            <w:r>
+              <w:rPr>
+                <w:color w:val="333333"/>
+                <w:sz w:val="18"/>
+                <w:szCs w:val="18"/>
+              </w:rPr>
+              <w:t xml:space="preserve"> 표 추출 · BAAI/bge-m3 </w:t>
+            </w:r>
+            <w:proofErr w:type="spellStart"/>
+            <w:r>
+              <w:rPr>
+                <w:color w:val="333333"/>
+                <w:sz w:val="18"/>
+                <w:szCs w:val="18"/>
+              </w:rPr>
+              <w:t>임베딩</w:t>
+            </w:r>
+            <w:proofErr w:type="spellEnd"/>
+            <w:r>
+              <w:rPr>
+                <w:color w:val="333333"/>
+                <w:sz w:val="18"/>
+                <w:szCs w:val="18"/>
+              </w:rPr>
+              <w:t xml:space="preserve"> · </w:t>
+            </w:r>
+            <w:proofErr w:type="spellStart"/>
+            <w:r>
+              <w:rPr>
+                <w:color w:val="333333"/>
+                <w:sz w:val="18"/>
+                <w:szCs w:val="18"/>
+              </w:rPr>
+              <w:t>ChromaDB</w:t>
+            </w:r>
+            <w:proofErr w:type="spellEnd"/>
+            <w:r>
+              <w:rPr>
+                <w:color w:val="333333"/>
+                <w:sz w:val="18"/>
+                <w:szCs w:val="18"/>
+              </w:rPr>
+              <w:t xml:space="preserve"> · 벡터+BM25 하이브리드 검색</w:t>
+            </w:r>
+          </w:p>
+          <w:p>
+            <w:pPr>
+              <w:pStyle w:val="a4"/>
+              <w:numPr>
+                <w:ilvl w:val="0"/>
+                <w:numId w:val="2"/>
+              </w:numPr>
+              <w:spacing w:before="16" w:after="16" w:line="300" w:lineRule="exact"/>
+            </w:pPr>
+            <w:r>
+              <w:rPr>
+                <w:color w:val="333333"/>
+                <w:sz w:val="18"/>
+                <w:szCs w:val="18"/>
+              </w:rPr>
+              <w:t>Ollama(qwen2.5:3b) 로컬 LLM · 시행규칙 우선 랭킹 · 사고 시나리오 컨텍스트 관리</w:t>
             </w:r>
           </w:p>
           <w:p>
@@ -2293,13 +2494,9 @@
                 <w:left w:val="none" w:sz="0" w:space="0" w:color="FFFFFF"/>
                 <w:bottom w:val="none" w:sz="0" w:space="0" w:color="FFFFFF"/>
                 <w:right w:val="none" w:sz="0" w:space="0" w:color="FFFFFF"/>
-                <w:insideH w:val="single" w:sz="4" w:space="0" w:color="auto"/>
-                <w:insideV w:val="single" w:sz="4" w:space="0" w:color="auto"/>
+                <w:insideH w:val="none" w:sz="0" w:space="0" w:color="FFFFFF"/>
+                <w:insideV w:val="none" w:sz="0" w:space="0" w:color="FFFFFF"/>
               </w:tblBorders>
-              <w:tblCellMar>
-                <w:left w:w="10" w:type="dxa"/>
-                <w:right w:w="10" w:type="dxa"/>
-              </w:tblCellMar>
               <w:tblLook w:val="04A0" w:firstRow="1" w:lastRow="0" w:firstColumn="1" w:lastColumn="0" w:noHBand="0" w:noVBand="1"/>
             </w:tblPr>
             <w:tblGrid>
@@ -2307,12 +2504,6 @@
               <w:gridCol w:w="2500"/>
             </w:tblGrid>
             <w:tr>
-              <w:tblPrEx>
-                <w:tblCellMar>
-                  <w:top w:w="0" w:type="dxa"/>
-                  <w:bottom w:w="0" w:type="dxa"/>
-                </w:tblCellMar>
-              </w:tblPrEx>
               <w:tc>
                 <w:tcPr>
                   <w:tcW w:w="5626" w:type="dxa"/>
@@ -2341,18 +2532,7 @@
                       <w:sz w:val="22"/>
                       <w:szCs w:val="22"/>
                     </w:rPr>
-                    <w:t>air-quality-</w:t>
-                  </w:r>
-                  <w:proofErr w:type="gramStart"/>
-                  <w:r>
-                    <w:rPr>
-                      <w:b/>
-                      <w:bCs/>
-                      <w:color w:val="1A1A1A"/>
-                      <w:sz w:val="22"/>
-                      <w:szCs w:val="22"/>
-                    </w:rPr>
-                    <w:t>forecast</w:t>
+                    <w:t>Artesia</w:t>
                   </w:r>
                   <w:r>
                     <w:rPr>
@@ -2360,16 +2540,7 @@
                       <w:sz w:val="18"/>
                       <w:szCs w:val="18"/>
                     </w:rPr>
-                    <w:t xml:space="preserve">  |</w:t>
-                  </w:r>
-                  <w:proofErr w:type="gramEnd"/>
-                  <w:r>
-                    <w:rPr>
-                      <w:color w:val="333333"/>
-                      <w:sz w:val="18"/>
-                      <w:szCs w:val="18"/>
-                    </w:rPr>
-                    <w:t xml:space="preserve">  월별 대기질 예측</w:t>
+                    <w:t xml:space="preserve">  |  팀장 · 기획</w:t>
                   </w:r>
                 </w:p>
               </w:tc>
@@ -2400,7 +2571,7 @@
                       <w:sz w:val="16"/>
                       <w:szCs w:val="16"/>
                     </w:rPr>
-                    <w:t>Python</w:t>
+                    <w:t>C# · Unity2D</w:t>
                   </w:r>
                 </w:p>
               </w:tc>
@@ -2413,15 +2584,15 @@
                 <w:ilvl w:val="0"/>
                 <w:numId w:val="2"/>
               </w:numPr>
-              <w:spacing w:before="16" w:line="300" w:after="16" w:lineRule="exact"/>
-            </w:pPr>
-            <w:r>
-              <w:rPr>
-                <w:color w:val="333333"/>
-                <w:sz w:val="18"/>
-                <w:szCs w:val="18"/>
-              </w:rPr>
-              <w:t>기상 및 환경 데이터 기반 대기질(PM2.5 등) 시계열 예측 모델 개발</w:t>
+              <w:spacing w:before="16" w:after="16" w:line="300" w:lineRule="exact"/>
+            </w:pPr>
+            <w:r>
+              <w:rPr>
+                <w:color w:val="333333"/>
+                <w:sz w:val="18"/>
+                <w:szCs w:val="18"/>
+              </w:rPr>
+              <w:t>Unity2D 기반 게임 프로젝트 팀장 및 기획 총괄 (팀 협업 리딩)</w:t>
             </w:r>
           </w:p>
           <w:p>
@@ -2431,15 +2602,15 @@
                 <w:ilvl w:val="0"/>
                 <w:numId w:val="2"/>
               </w:numPr>
-              <w:spacing w:before="16" w:line="300" w:after="16" w:lineRule="exact"/>
-            </w:pPr>
-            <w:r>
-              <w:rPr>
-                <w:color w:val="333333"/>
-                <w:sz w:val="18"/>
-                <w:szCs w:val="18"/>
-              </w:rPr>
-              <w:t>피처 엔지니어링 및 모델 성능 최적화</w:t>
+              <w:spacing w:before="16" w:after="16" w:line="300" w:lineRule="exact"/>
+            </w:pPr>
+            <w:r>
+              <w:rPr>
+                <w:color w:val="333333"/>
+                <w:sz w:val="18"/>
+                <w:szCs w:val="18"/>
+              </w:rPr>
+              <w:t>게임 기획·설계·개발 전 과정 주도, 팀원 역할 분배 및 일정 관리</w:t>
             </w:r>
           </w:p>
           <w:p>
@@ -2455,13 +2626,9 @@
                 <w:left w:val="none" w:sz="0" w:space="0" w:color="FFFFFF"/>
                 <w:bottom w:val="none" w:sz="0" w:space="0" w:color="FFFFFF"/>
                 <w:right w:val="none" w:sz="0" w:space="0" w:color="FFFFFF"/>
-                <w:insideH w:val="single" w:sz="4" w:space="0" w:color="auto"/>
-                <w:insideV w:val="single" w:sz="4" w:space="0" w:color="auto"/>
+                <w:insideH w:val="none" w:sz="0" w:space="0" w:color="FFFFFF"/>
+                <w:insideV w:val="none" w:sz="0" w:space="0" w:color="FFFFFF"/>
               </w:tblBorders>
-              <w:tblCellMar>
-                <w:left w:w="10" w:type="dxa"/>
-                <w:right w:w="10" w:type="dxa"/>
-              </w:tblCellMar>
               <w:tblLook w:val="04A0" w:firstRow="1" w:lastRow="0" w:firstColumn="1" w:lastColumn="0" w:noHBand="0" w:noVBand="1"/>
             </w:tblPr>
             <w:tblGrid>
@@ -2469,12 +2636,6 @@
               <w:gridCol w:w="2500"/>
             </w:tblGrid>
             <w:tr>
-              <w:tblPrEx>
-                <w:tblCellMar>
-                  <w:top w:w="0" w:type="dxa"/>
-                  <w:bottom w:w="0" w:type="dxa"/>
-                </w:tblCellMar>
-              </w:tblPrEx>
               <w:tc>
                 <w:tcPr>
                   <w:tcW w:w="5626" w:type="dxa"/>
@@ -2503,35 +2664,7 @@
                       <w:sz w:val="22"/>
                       <w:szCs w:val="22"/>
                     </w:rPr>
-                    <w:t>market-</w:t>
-                  </w:r>
-                  <w:proofErr w:type="gramStart"/>
-                  <w:r>
-                    <w:rPr>
-                      <w:b/>
-                      <w:bCs/>
-                      <w:color w:val="1A1A1A"/>
-                      <w:sz w:val="22"/>
-                      <w:szCs w:val="22"/>
-                    </w:rPr>
-                    <w:t>pulse</w:t>
-                  </w:r>
-                  <w:r>
-                    <w:rPr>
-                      <w:color w:val="333333"/>
-                      <w:sz w:val="18"/>
-                      <w:szCs w:val="18"/>
-                    </w:rPr>
-                    <w:t xml:space="preserve">  |</w:t>
-                  </w:r>
-                  <w:proofErr w:type="gramEnd"/>
-                  <w:r>
-                    <w:rPr>
-                      <w:color w:val="333333"/>
-                      <w:sz w:val="18"/>
-                      <w:szCs w:val="18"/>
-                    </w:rPr>
-                    <w:t xml:space="preserve">  다나와 PC 부품 가격 분석</w:t>
+                    <w:t>ecommerce-data-analysis-practice</w:t>
                   </w:r>
                 </w:p>
               </w:tc>
@@ -2556,13 +2689,23 @@
                     <w:spacing w:line="300" w:lineRule="exact"/>
                     <w:jc w:val="right"/>
                   </w:pPr>
+                  <w:proofErr w:type="spellStart"/>
                   <w:r>
                     <w:rPr>
                       <w:color w:val="999999"/>
                       <w:sz w:val="16"/>
                       <w:szCs w:val="16"/>
                     </w:rPr>
-                    <w:t>Python</w:t>
+                    <w:t>Jupyter</w:t>
+                  </w:r>
+                  <w:proofErr w:type="spellEnd"/>
+                  <w:r>
+                    <w:rPr>
+                      <w:color w:val="999999"/>
+                      <w:sz w:val="16"/>
+                      <w:szCs w:val="16"/>
+                    </w:rPr>
+                    <w:t xml:space="preserve"> Notebook</w:t>
                   </w:r>
                 </w:p>
               </w:tc>
@@ -2575,15 +2718,33 @@
                 <w:ilvl w:val="0"/>
                 <w:numId w:val="2"/>
               </w:numPr>
-              <w:spacing w:before="16" w:line="300" w:after="16" w:lineRule="exact"/>
-            </w:pPr>
-            <w:r>
-              <w:rPr>
-                <w:color w:val="333333"/>
-                <w:sz w:val="18"/>
-                <w:szCs w:val="18"/>
-              </w:rPr>
-              <w:t>다나와 PC 부품 가격 자동 수집(크롤링) 및 이상치 탐지</w:t>
+              <w:spacing w:before="16" w:after="16" w:line="300" w:lineRule="exact"/>
+            </w:pPr>
+            <w:r>
+              <w:rPr>
+                <w:color w:val="333333"/>
+                <w:sz w:val="18"/>
+                <w:szCs w:val="18"/>
+              </w:rPr>
+              <w:t xml:space="preserve">SQL · RFM 분석 · </w:t>
+            </w:r>
+            <w:proofErr w:type="spellStart"/>
+            <w:r>
+              <w:rPr>
+                <w:color w:val="333333"/>
+                <w:sz w:val="18"/>
+                <w:szCs w:val="18"/>
+              </w:rPr>
+              <w:t>머신러닝</w:t>
+            </w:r>
+            <w:proofErr w:type="spellEnd"/>
+            <w:r>
+              <w:rPr>
+                <w:color w:val="333333"/>
+                <w:sz w:val="18"/>
+                <w:szCs w:val="18"/>
+              </w:rPr>
+              <w:t xml:space="preserve"> · 시계열 예측 · SQLD까지 직접 설계 및 수행</w:t>
             </w:r>
           </w:p>
           <w:p>
@@ -2593,15 +2754,33 @@
                 <w:ilvl w:val="0"/>
                 <w:numId w:val="2"/>
               </w:numPr>
-              <w:spacing w:before="16" w:line="300" w:after="16" w:lineRule="exact"/>
-            </w:pPr>
-            <w:r>
-              <w:rPr>
-                <w:color w:val="333333"/>
-                <w:sz w:val="18"/>
-                <w:szCs w:val="18"/>
-              </w:rPr>
-              <w:t>가격 예측 머신러닝 모델 구축 및 Streamlit 대시보드 개발</w:t>
+              <w:spacing w:before="16" w:after="16" w:line="300" w:lineRule="exact"/>
+            </w:pPr>
+            <w:r>
+              <w:rPr>
+                <w:color w:val="333333"/>
+                <w:sz w:val="18"/>
+                <w:szCs w:val="18"/>
+              </w:rPr>
+              <w:t xml:space="preserve">실무 수준의 </w:t>
+            </w:r>
+            <w:proofErr w:type="spellStart"/>
+            <w:r>
+              <w:rPr>
+                <w:color w:val="333333"/>
+                <w:sz w:val="18"/>
+                <w:szCs w:val="18"/>
+              </w:rPr>
+              <w:t>이커머스</w:t>
+            </w:r>
+            <w:proofErr w:type="spellEnd"/>
+            <w:r>
+              <w:rPr>
+                <w:color w:val="333333"/>
+                <w:sz w:val="18"/>
+                <w:szCs w:val="18"/>
+              </w:rPr>
+              <w:t xml:space="preserve"> 데이터 분석 파이프라인 구축</w:t>
             </w:r>
           </w:p>
           <w:p>
@@ -2617,13 +2796,9 @@
                 <w:left w:val="none" w:sz="0" w:space="0" w:color="FFFFFF"/>
                 <w:bottom w:val="none" w:sz="0" w:space="0" w:color="FFFFFF"/>
                 <w:right w:val="none" w:sz="0" w:space="0" w:color="FFFFFF"/>
-                <w:insideH w:val="single" w:sz="4" w:space="0" w:color="auto"/>
-                <w:insideV w:val="single" w:sz="4" w:space="0" w:color="auto"/>
+                <w:insideH w:val="none" w:sz="0" w:space="0" w:color="FFFFFF"/>
+                <w:insideV w:val="none" w:sz="0" w:space="0" w:color="FFFFFF"/>
               </w:tblBorders>
-              <w:tblCellMar>
-                <w:left w:w="10" w:type="dxa"/>
-                <w:right w:w="10" w:type="dxa"/>
-              </w:tblCellMar>
               <w:tblLook w:val="04A0" w:firstRow="1" w:lastRow="0" w:firstColumn="1" w:lastColumn="0" w:noHBand="0" w:noVBand="1"/>
             </w:tblPr>
             <w:tblGrid>
@@ -2631,12 +2806,6 @@
               <w:gridCol w:w="2500"/>
             </w:tblGrid>
             <w:tr>
-              <w:tblPrEx>
-                <w:tblCellMar>
-                  <w:top w:w="0" w:type="dxa"/>
-                  <w:bottom w:w="0" w:type="dxa"/>
-                </w:tblCellMar>
-              </w:tblPrEx>
               <w:tc>
                 <w:tcPr>
                   <w:tcW w:w="5626" w:type="dxa"/>
@@ -2657,6 +2826,7 @@
                   <w:pPr>
                     <w:spacing w:line="300" w:lineRule="exact"/>
                   </w:pPr>
+                  <w:proofErr w:type="spellStart"/>
                   <w:r>
                     <w:rPr>
                       <w:b/>
@@ -2665,9 +2835,9 @@
                       <w:sz w:val="22"/>
                       <w:szCs w:val="22"/>
                     </w:rPr>
-                    <w:t>bigdata-eda-</w:t>
-                  </w:r>
-                  <w:proofErr w:type="gramStart"/>
+                    <w:t>english</w:t>
+                  </w:r>
+                  <w:proofErr w:type="spellEnd"/>
                   <w:r>
                     <w:rPr>
                       <w:b/>
@@ -2676,24 +2846,45 @@
                       <w:sz w:val="22"/>
                       <w:szCs w:val="22"/>
                     </w:rPr>
-                    <w:t>practice</w:t>
-                  </w:r>
+                    <w:t>-word-</w:t>
+                  </w:r>
+                  <w:proofErr w:type="spellStart"/>
+                  <w:r>
+                    <w:rPr>
+                      <w:b/>
+                      <w:bCs/>
+                      <w:color w:val="1A1A1A"/>
+                      <w:sz w:val="22"/>
+                      <w:szCs w:val="22"/>
+                    </w:rPr>
+                    <w:t>streamlit</w:t>
+                  </w:r>
+                  <w:proofErr w:type="spellEnd"/>
                   <w:r>
                     <w:rPr>
                       <w:color w:val="333333"/>
                       <w:sz w:val="18"/>
                       <w:szCs w:val="18"/>
                     </w:rPr>
-                    <w:t xml:space="preserve">  |</w:t>
-                  </w:r>
-                  <w:proofErr w:type="gramEnd"/>
+                    <w:t xml:space="preserve">  |  </w:t>
+                  </w:r>
+                  <w:proofErr w:type="spellStart"/>
                   <w:r>
                     <w:rPr>
                       <w:color w:val="333333"/>
                       <w:sz w:val="18"/>
                       <w:szCs w:val="18"/>
                     </w:rPr>
-                    <w:t xml:space="preserve">  타이타닉 데이터 EDA</w:t>
+                    <w:t>영단어</w:t>
+                  </w:r>
+                  <w:proofErr w:type="spellEnd"/>
+                  <w:r>
+                    <w:rPr>
+                      <w:color w:val="333333"/>
+                      <w:sz w:val="18"/>
+                      <w:szCs w:val="18"/>
+                    </w:rPr>
+                    <w:t xml:space="preserve"> 학습 앱</w:t>
                   </w:r>
                 </w:p>
               </w:tc>
@@ -2724,8 +2915,18 @@
                       <w:sz w:val="16"/>
                       <w:szCs w:val="16"/>
                     </w:rPr>
-                    <w:t>Jupyter Notebook</w:t>
-                  </w:r>
+                    <w:t xml:space="preserve">Python · </w:t>
+                  </w:r>
+                  <w:proofErr w:type="spellStart"/>
+                  <w:r>
+                    <w:rPr>
+                      <w:color w:val="999999"/>
+                      <w:sz w:val="16"/>
+                      <w:szCs w:val="16"/>
+                    </w:rPr>
+                    <w:t>Streamlit</w:t>
+                  </w:r>
+                  <w:proofErr w:type="spellEnd"/>
                 </w:p>
               </w:tc>
             </w:tr>
@@ -2737,15 +2938,43 @@
                 <w:ilvl w:val="0"/>
                 <w:numId w:val="2"/>
               </w:numPr>
-              <w:spacing w:before="16" w:line="300" w:after="16" w:lineRule="exact"/>
-            </w:pPr>
-            <w:r>
-              <w:rPr>
-                <w:color w:val="333333"/>
-                <w:sz w:val="18"/>
-                <w:szCs w:val="18"/>
-              </w:rPr>
-              <w:t>데이터 전처리(결측치 처리, 이상치 제거), 피처 엔지니어링, EDA 전 과정 실습</w:t>
+              <w:spacing w:before="16" w:after="16" w:line="300" w:lineRule="exact"/>
+            </w:pPr>
+            <w:proofErr w:type="spellStart"/>
+            <w:r>
+              <w:rPr>
+                <w:color w:val="333333"/>
+                <w:sz w:val="18"/>
+                <w:szCs w:val="18"/>
+              </w:rPr>
+              <w:t>Streamlit</w:t>
+            </w:r>
+            <w:proofErr w:type="spellEnd"/>
+            <w:r>
+              <w:rPr>
+                <w:color w:val="333333"/>
+                <w:sz w:val="18"/>
+                <w:szCs w:val="18"/>
+              </w:rPr>
+              <w:t xml:space="preserve"> 기반 </w:t>
+            </w:r>
+            <w:proofErr w:type="spellStart"/>
+            <w:r>
+              <w:rPr>
+                <w:color w:val="333333"/>
+                <w:sz w:val="18"/>
+                <w:szCs w:val="18"/>
+              </w:rPr>
+              <w:t>영단어</w:t>
+            </w:r>
+            <w:proofErr w:type="spellEnd"/>
+            <w:r>
+              <w:rPr>
+                <w:color w:val="333333"/>
+                <w:sz w:val="18"/>
+                <w:szCs w:val="18"/>
+              </w:rPr>
+              <w:t xml:space="preserve"> 학습 웹 앱 개발</w:t>
             </w:r>
           </w:p>
           <w:p>
@@ -2755,15 +2984,15 @@
                 <w:ilvl w:val="0"/>
                 <w:numId w:val="2"/>
               </w:numPr>
-              <w:spacing w:before="16" w:line="300" w:after="16" w:lineRule="exact"/>
-            </w:pPr>
-            <w:r>
-              <w:rPr>
-                <w:color w:val="333333"/>
-                <w:sz w:val="18"/>
-                <w:szCs w:val="18"/>
-              </w:rPr>
-              <w:t>머신러닝 모델 구축 및 성능 평가</w:t>
+              <w:spacing w:before="16" w:after="16" w:line="300" w:lineRule="exact"/>
+            </w:pPr>
+            <w:r>
+              <w:rPr>
+                <w:color w:val="333333"/>
+                <w:sz w:val="18"/>
+                <w:szCs w:val="18"/>
+              </w:rPr>
+              <w:t>단어 학습 진도 추적 및 퀴즈 기능 구현</w:t>
             </w:r>
           </w:p>
           <w:p>
@@ -2779,13 +3008,9 @@
                 <w:left w:val="none" w:sz="0" w:space="0" w:color="FFFFFF"/>
                 <w:bottom w:val="none" w:sz="0" w:space="0" w:color="FFFFFF"/>
                 <w:right w:val="none" w:sz="0" w:space="0" w:color="FFFFFF"/>
-                <w:insideH w:val="single" w:sz="4" w:space="0" w:color="auto"/>
-                <w:insideV w:val="single" w:sz="4" w:space="0" w:color="auto"/>
+                <w:insideH w:val="none" w:sz="0" w:space="0" w:color="FFFFFF"/>
+                <w:insideV w:val="none" w:sz="0" w:space="0" w:color="FFFFFF"/>
               </w:tblBorders>
-              <w:tblCellMar>
-                <w:left w:w="10" w:type="dxa"/>
-                <w:right w:w="10" w:type="dxa"/>
-              </w:tblCellMar>
               <w:tblLook w:val="04A0" w:firstRow="1" w:lastRow="0" w:firstColumn="1" w:lastColumn="0" w:noHBand="0" w:noVBand="1"/>
             </w:tblPr>
             <w:tblGrid>
@@ -2793,12 +3018,6 @@
               <w:gridCol w:w="2500"/>
             </w:tblGrid>
             <w:tr>
-              <w:tblPrEx>
-                <w:tblCellMar>
-                  <w:top w:w="0" w:type="dxa"/>
-                  <w:bottom w:w="0" w:type="dxa"/>
-                </w:tblCellMar>
-              </w:tblPrEx>
               <w:tc>
                 <w:tcPr>
                   <w:tcW w:w="5626" w:type="dxa"/>
@@ -2819,7 +3038,6 @@
                   <w:pPr>
                     <w:spacing w:line="300" w:lineRule="exact"/>
                   </w:pPr>
-                  <w:proofErr w:type="gramStart"/>
                   <w:r>
                     <w:rPr>
                       <w:b/>
@@ -2828,7 +3046,7 @@
                       <w:sz w:val="22"/>
                       <w:szCs w:val="22"/>
                     </w:rPr>
-                    <w:t>Artesia</w:t>
+                    <w:t>market-pulse</w:t>
                   </w:r>
                   <w:r>
                     <w:rPr>
@@ -2836,16 +3054,25 @@
                       <w:sz w:val="18"/>
                       <w:szCs w:val="18"/>
                     </w:rPr>
-                    <w:t xml:space="preserve">  |</w:t>
-                  </w:r>
-                  <w:proofErr w:type="gramEnd"/>
+                    <w:t xml:space="preserve">  |  </w:t>
+                  </w:r>
+                  <w:proofErr w:type="spellStart"/>
                   <w:r>
                     <w:rPr>
                       <w:color w:val="333333"/>
                       <w:sz w:val="18"/>
                       <w:szCs w:val="18"/>
                     </w:rPr>
-                    <w:t xml:space="preserve">  팀장 · 기획</w:t>
+                    <w:t>다나와</w:t>
+                  </w:r>
+                  <w:proofErr w:type="spellEnd"/>
+                  <w:r>
+                    <w:rPr>
+                      <w:color w:val="333333"/>
+                      <w:sz w:val="18"/>
+                      <w:szCs w:val="18"/>
+                    </w:rPr>
+                    <w:t xml:space="preserve"> PC 부품 가격 분석</w:t>
                   </w:r>
                 </w:p>
               </w:tc>
@@ -2876,7 +3103,7 @@
                       <w:sz w:val="16"/>
                       <w:szCs w:val="16"/>
                     </w:rPr>
-                    <w:t>C# · Unity2D</w:t>
+                    <w:t>Python</w:t>
                   </w:r>
                 </w:p>
               </w:tc>
@@ -2889,15 +3116,43 @@
                 <w:ilvl w:val="0"/>
                 <w:numId w:val="2"/>
               </w:numPr>
-              <w:spacing w:before="16" w:line="300" w:after="16" w:lineRule="exact"/>
-            </w:pPr>
-            <w:r>
-              <w:rPr>
-                <w:color w:val="333333"/>
-                <w:sz w:val="18"/>
-                <w:szCs w:val="18"/>
-              </w:rPr>
-              <w:t>Unity2D 기반 게임 프로젝트 팀장 및 기획 총괄 (팀 협업 리딩)</w:t>
+              <w:spacing w:before="16" w:after="16" w:line="300" w:lineRule="exact"/>
+            </w:pPr>
+            <w:proofErr w:type="spellStart"/>
+            <w:r>
+              <w:rPr>
+                <w:color w:val="333333"/>
+                <w:sz w:val="18"/>
+                <w:szCs w:val="18"/>
+              </w:rPr>
+              <w:t>다나와</w:t>
+            </w:r>
+            <w:proofErr w:type="spellEnd"/>
+            <w:r>
+              <w:rPr>
+                <w:color w:val="333333"/>
+                <w:sz w:val="18"/>
+                <w:szCs w:val="18"/>
+              </w:rPr>
+              <w:t xml:space="preserve"> PC 부품 가격 자동 수집(</w:t>
+            </w:r>
+            <w:proofErr w:type="spellStart"/>
+            <w:r>
+              <w:rPr>
+                <w:color w:val="333333"/>
+                <w:sz w:val="18"/>
+                <w:szCs w:val="18"/>
+              </w:rPr>
+              <w:t>크롤링</w:t>
+            </w:r>
+            <w:proofErr w:type="spellEnd"/>
+            <w:r>
+              <w:rPr>
+                <w:color w:val="333333"/>
+                <w:sz w:val="18"/>
+                <w:szCs w:val="18"/>
+              </w:rPr>
+              <w:t>) 및 이상치 탐지</w:t>
             </w:r>
           </w:p>
           <w:p>
@@ -2907,15 +3162,185 @@
                 <w:ilvl w:val="0"/>
                 <w:numId w:val="2"/>
               </w:numPr>
-              <w:spacing w:before="16" w:line="300" w:after="16" w:lineRule="exact"/>
-            </w:pPr>
-            <w:r>
-              <w:rPr>
-                <w:color w:val="333333"/>
-                <w:sz w:val="18"/>
-                <w:szCs w:val="18"/>
-              </w:rPr>
-              <w:t>게임 기획·설계·개발 전 과정 주도, 팀원 역할 분배 및 일정 관리</w:t>
+              <w:spacing w:before="16" w:after="16" w:line="300" w:lineRule="exact"/>
+            </w:pPr>
+            <w:r>
+              <w:rPr>
+                <w:color w:val="333333"/>
+                <w:sz w:val="18"/>
+                <w:szCs w:val="18"/>
+              </w:rPr>
+              <w:t xml:space="preserve">가격 예측 </w:t>
+            </w:r>
+            <w:proofErr w:type="spellStart"/>
+            <w:r>
+              <w:rPr>
+                <w:color w:val="333333"/>
+                <w:sz w:val="18"/>
+                <w:szCs w:val="18"/>
+              </w:rPr>
+              <w:t>머신러닝</w:t>
+            </w:r>
+            <w:proofErr w:type="spellEnd"/>
+            <w:r>
+              <w:rPr>
+                <w:color w:val="333333"/>
+                <w:sz w:val="18"/>
+                <w:szCs w:val="18"/>
+              </w:rPr>
+              <w:t xml:space="preserve"> 모델 구축 및 </w:t>
+            </w:r>
+            <w:proofErr w:type="spellStart"/>
+            <w:r>
+              <w:rPr>
+                <w:color w:val="333333"/>
+                <w:sz w:val="18"/>
+                <w:szCs w:val="18"/>
+              </w:rPr>
+              <w:t>Streamlit</w:t>
+            </w:r>
+            <w:proofErr w:type="spellEnd"/>
+            <w:r>
+              <w:rPr>
+                <w:color w:val="333333"/>
+                <w:sz w:val="18"/>
+                <w:szCs w:val="18"/>
+              </w:rPr>
+              <w:t xml:space="preserve"> 대시보드 개발</w:t>
+            </w:r>
+          </w:p>
+          <w:p>
+            <w:pPr>
+              <w:spacing w:before="32" w:line="80" w:lineRule="exact"/>
+            </w:pPr>
+          </w:p>
+          <w:tbl>
+            <w:tblPr>
+              <w:tblW w:w="8126" w:type="dxa"/>
+              <w:tblBorders>
+                <w:top w:val="none" w:sz="0" w:space="0" w:color="FFFFFF"/>
+                <w:left w:val="none" w:sz="0" w:space="0" w:color="FFFFFF"/>
+                <w:bottom w:val="none" w:sz="0" w:space="0" w:color="FFFFFF"/>
+                <w:right w:val="none" w:sz="0" w:space="0" w:color="FFFFFF"/>
+                <w:insideH w:val="none" w:sz="0" w:space="0" w:color="FFFFFF"/>
+                <w:insideV w:val="none" w:sz="0" w:space="0" w:color="FFFFFF"/>
+              </w:tblBorders>
+              <w:tblLook w:val="04A0" w:firstRow="1" w:lastRow="0" w:firstColumn="1" w:lastColumn="0" w:noHBand="0" w:noVBand="1"/>
+            </w:tblPr>
+            <w:tblGrid>
+              <w:gridCol w:w="5626"/>
+              <w:gridCol w:w="2500"/>
+            </w:tblGrid>
+            <w:tr>
+              <w:tc>
+                <w:tcPr>
+                  <w:tcW w:w="5626" w:type="dxa"/>
+                  <w:tcBorders>
+                    <w:top w:val="none" w:sz="0" w:space="0" w:color="FFFFFF"/>
+                    <w:left w:val="none" w:sz="0" w:space="0" w:color="FFFFFF"/>
+                    <w:bottom w:val="none" w:sz="0" w:space="0" w:color="FFFFFF"/>
+                    <w:right w:val="none" w:sz="0" w:space="0" w:color="FFFFFF"/>
+                  </w:tcBorders>
+                  <w:tcMar>
+                    <w:top w:w="0" w:type="dxa"/>
+                    <w:left w:w="0" w:type="dxa"/>
+                    <w:bottom w:w="0" w:type="dxa"/>
+                    <w:right w:w="0" w:type="dxa"/>
+                  </w:tcMar>
+                </w:tcPr>
+                <w:p>
+                  <w:pPr>
+                    <w:spacing w:line="300" w:lineRule="exact"/>
+                  </w:pPr>
+                  <w:r>
+                    <w:rPr>
+                      <w:b/>
+                      <w:bCs/>
+                      <w:color w:val="1A1A1A"/>
+                      <w:sz w:val="22"/>
+                      <w:szCs w:val="22"/>
+                    </w:rPr>
+                    <w:t>O2O-demand-forecasting-solution</w:t>
+                  </w:r>
+                </w:p>
+              </w:tc>
+              <w:tc>
+                <w:tcPr>
+                  <w:tcW w:w="2500" w:type="dxa"/>
+                  <w:tcBorders>
+                    <w:top w:val="none" w:sz="0" w:space="0" w:color="FFFFFF"/>
+                    <w:left w:val="none" w:sz="0" w:space="0" w:color="FFFFFF"/>
+                    <w:bottom w:val="none" w:sz="0" w:space="0" w:color="FFFFFF"/>
+                    <w:right w:val="none" w:sz="0" w:space="0" w:color="FFFFFF"/>
+                  </w:tcBorders>
+                  <w:tcMar>
+                    <w:top w:w="0" w:type="dxa"/>
+                    <w:left w:w="0" w:type="dxa"/>
+                    <w:bottom w:w="0" w:type="dxa"/>
+                    <w:right w:w="0" w:type="dxa"/>
+                  </w:tcMar>
+                </w:tcPr>
+                <w:p>
+                  <w:pPr>
+                    <w:spacing w:line="300" w:lineRule="exact"/>
+                    <w:jc w:val="right"/>
+                  </w:pPr>
+                  <w:proofErr w:type="spellStart"/>
+                  <w:r>
+                    <w:rPr>
+                      <w:color w:val="999999"/>
+                      <w:sz w:val="16"/>
+                      <w:szCs w:val="16"/>
+                    </w:rPr>
+                    <w:t>Jupyter</w:t>
+                  </w:r>
+                  <w:proofErr w:type="spellEnd"/>
+                  <w:r>
+                    <w:rPr>
+                      <w:color w:val="999999"/>
+                      <w:sz w:val="16"/>
+                      <w:szCs w:val="16"/>
+                    </w:rPr>
+                    <w:t xml:space="preserve"> Notebook</w:t>
+                  </w:r>
+                </w:p>
+              </w:tc>
+            </w:tr>
+          </w:tbl>
+          <w:p>
+            <w:pPr>
+              <w:pStyle w:val="a4"/>
+              <w:numPr>
+                <w:ilvl w:val="0"/>
+                <w:numId w:val="2"/>
+              </w:numPr>
+              <w:spacing w:before="16" w:after="16" w:line="300" w:lineRule="exact"/>
+            </w:pPr>
+            <w:r>
+              <w:rPr>
+                <w:color w:val="333333"/>
+                <w:sz w:val="18"/>
+                <w:szCs w:val="18"/>
+              </w:rPr>
+              <w:t>O2O 서비스 기반 수요 예측 모델 설계 및 구현</w:t>
+            </w:r>
+          </w:p>
+          <w:p>
+            <w:pPr>
+              <w:pStyle w:val="a4"/>
+              <w:numPr>
+                <w:ilvl w:val="0"/>
+                <w:numId w:val="2"/>
+              </w:numPr>
+              <w:spacing w:before="16" w:after="16" w:line="300" w:lineRule="exact"/>
+            </w:pPr>
+            <w:r>
+              <w:rPr>
+                <w:color w:val="333333"/>
+                <w:sz w:val="18"/>
+                <w:szCs w:val="18"/>
+              </w:rPr>
+              <w:t>시계열 데이터 분석 및 예측 성능 최적화</w:t>
             </w:r>
           </w:p>
           <w:p>
@@ -2928,7 +3353,7 @@
               <w:pBdr>
                 <w:bottom w:val="single" w:sz="6" w:space="3" w:color="C8973A"/>
               </w:pBdr>
-              <w:spacing w:before="324" w:line="360" w:after="68" w:lineRule="exact"/>
+              <w:spacing w:before="324" w:after="68" w:line="360" w:lineRule="exact"/>
             </w:pPr>
             <w:r>
               <w:rPr>
@@ -2964,12 +3389,6 @@
               <w:gridCol w:w="2709"/>
             </w:tblGrid>
             <w:tr>
-              <w:tblPrEx>
-                <w:tblCellMar>
-                  <w:top w:w="0" w:type="dxa"/>
-                  <w:bottom w:w="0" w:type="dxa"/>
-                </w:tblCellMar>
-              </w:tblPrEx>
               <w:tc>
                 <w:tcPr>
                   <w:tcW w:w="2708" w:type="dxa"/>
@@ -2989,7 +3408,7 @@
                 </w:tcPr>
                 <w:p>
                   <w:pPr>
-                    <w:spacing w:line="300" w:after="32" w:lineRule="exact"/>
+                    <w:spacing w:after="32" w:line="300" w:lineRule="exact"/>
                   </w:pPr>
                   <w:r>
                     <w:rPr>
@@ -3002,20 +3421,30 @@
                 </w:p>
                 <w:p>
                   <w:pPr>
-                    <w:spacing w:line="300" w:after="14" w:lineRule="exact"/>
+                    <w:spacing w:after="14" w:line="300" w:lineRule="exact"/>
                   </w:pPr>
+                  <w:proofErr w:type="spellStart"/>
                   <w:r>
                     <w:rPr>
                       <w:color w:val="666666"/>
                       <w:sz w:val="18"/>
                       <w:szCs w:val="18"/>
                     </w:rPr>
-                    <w:t>빅데이터분석기사 보유</w:t>
+                    <w:t>빅데이터분석기사</w:t>
+                  </w:r>
+                  <w:proofErr w:type="spellEnd"/>
+                  <w:r>
+                    <w:rPr>
+                      <w:color w:val="666666"/>
+                      <w:sz w:val="18"/>
+                      <w:szCs w:val="18"/>
+                    </w:rPr>
+                    <w:t xml:space="preserve"> 보유</w:t>
                   </w:r>
                 </w:p>
                 <w:p>
                   <w:pPr>
-                    <w:spacing w:line="300" w:after="14" w:lineRule="exact"/>
+                    <w:spacing w:after="14" w:line="300" w:lineRule="exact"/>
                   </w:pPr>
                   <w:proofErr w:type="gramStart"/>
                   <w:r>
@@ -3038,7 +3467,7 @@
                 </w:p>
                 <w:p>
                   <w:pPr>
-                    <w:spacing w:line="300" w:after="14" w:lineRule="exact"/>
+                    <w:spacing w:after="14" w:line="300" w:lineRule="exact"/>
                   </w:pPr>
                   <w:r>
                     <w:rPr>
@@ -3069,7 +3498,7 @@
                 </w:tcPr>
                 <w:p>
                   <w:pPr>
-                    <w:spacing w:line="300" w:after="32" w:lineRule="exact"/>
+                    <w:spacing w:after="32" w:line="300" w:lineRule="exact"/>
                   </w:pPr>
                   <w:r>
                     <w:rPr>
@@ -3082,7 +3511,7 @@
                 </w:p>
                 <w:p>
                   <w:pPr>
-                    <w:spacing w:line="300" w:after="14" w:lineRule="exact"/>
+                    <w:spacing w:after="14" w:line="300" w:lineRule="exact"/>
                   </w:pPr>
                   <w:r>
                     <w:rPr>
@@ -3095,7 +3524,7 @@
                 </w:p>
                 <w:p>
                   <w:pPr>
-                    <w:spacing w:line="300" w:after="14" w:lineRule="exact"/>
+                    <w:spacing w:after="14" w:line="300" w:lineRule="exact"/>
                   </w:pPr>
                   <w:r>
                     <w:rPr>
@@ -3108,7 +3537,7 @@
                 </w:p>
                 <w:p>
                   <w:pPr>
-                    <w:spacing w:line="300" w:after="14" w:lineRule="exact"/>
+                    <w:spacing w:after="14" w:line="300" w:lineRule="exact"/>
                   </w:pPr>
                   <w:r>
                     <w:rPr>
@@ -3139,7 +3568,7 @@
                 </w:tcPr>
                 <w:p>
                   <w:pPr>
-                    <w:spacing w:line="300" w:after="32" w:lineRule="exact"/>
+                    <w:spacing w:after="32" w:line="300" w:lineRule="exact"/>
                   </w:pPr>
                   <w:r>
                     <w:rPr>
@@ -3152,7 +3581,7 @@
                 </w:p>
                 <w:p>
                   <w:pPr>
-                    <w:spacing w:line="300" w:after="14" w:lineRule="exact"/>
+                    <w:spacing w:after="14" w:line="300" w:lineRule="exact"/>
                   </w:pPr>
                   <w:r>
                     <w:rPr>
@@ -3165,7 +3594,7 @@
                 </w:p>
                 <w:p>
                   <w:pPr>
-                    <w:spacing w:line="300" w:after="14" w:lineRule="exact"/>
+                    <w:spacing w:after="14" w:line="300" w:lineRule="exact"/>
                   </w:pPr>
                   <w:r>
                     <w:rPr>
@@ -3178,15 +3607,25 @@
                 </w:p>
                 <w:p>
                   <w:pPr>
-                    <w:spacing w:line="300" w:after="14" w:lineRule="exact"/>
+                    <w:spacing w:after="14" w:line="300" w:lineRule="exact"/>
                   </w:pPr>
+                  <w:proofErr w:type="spellStart"/>
                   <w:r>
                     <w:rPr>
                       <w:color w:val="666666"/>
                       <w:sz w:val="18"/>
                       <w:szCs w:val="18"/>
                     </w:rPr>
-                    <w:t>백엔드 개발 기초 역량</w:t>
+                    <w:t>백엔드</w:t>
+                  </w:r>
+                  <w:proofErr w:type="spellEnd"/>
+                  <w:r>
+                    <w:rPr>
+                      <w:color w:val="666666"/>
+                      <w:sz w:val="18"/>
+                      <w:szCs w:val="18"/>
+                    </w:rPr>
+                    <w:t xml:space="preserve"> 개발 기초 역량</w:t>
                   </w:r>
                 </w:p>
               </w:tc>
@@ -3380,14 +3819,9 @@
 <file path=word/styles.xml><?xml version="1.0" encoding="utf-8"?>
 <w:styles xmlns:mc="http://schemas.openxmlformats.org/markup-compatibility/2006" xmlns:r="http://schemas.openxmlformats.org/officeDocument/2006/relationships" xmlns:w="http://schemas.openxmlformats.org/wordprocessingml/2006/main" xmlns:w14="http://schemas.microsoft.com/office/word/2010/wordml" xmlns:w15="http://schemas.microsoft.com/office/word/2012/wordml" xmlns:w16cex="http://schemas.microsoft.com/office/word/2018/wordml/cex" xmlns:w16cid="http://schemas.microsoft.com/office/word/2016/wordml/cid" xmlns:w16="http://schemas.microsoft.com/office/word/2018/wordml" xmlns:w16du="http://schemas.microsoft.com/office/word/2023/wordml/word16du" xmlns:w16sdtdh="http://schemas.microsoft.com/office/word/2020/wordml/sdtdatahash" xmlns:w16sdtfl="http://schemas.microsoft.com/office/word/2024/wordml/sdtformatlock" xmlns:w16se="http://schemas.microsoft.com/office/word/2015/wordml/symex" mc:Ignorable="w14 w15 w16se w16cid w16 w16cex w16sdtdh w16sdtfl w16du">
   <w:docDefaults>
-    <w:pPrDefault>
-      <w:pPr>
-        <w:spacing w:before="0" w:after="0" w:line="240" w:lineRule="exact"/>
-      </w:pPr>
-    </w:pPrDefault>
     <w:rPrDefault>
       <w:rPr>
-        <w:rFonts w:ascii="Malgun Gothic" w:eastAsia="Malgun Gothic" w:hAnsi="Malgun Gothic" w:cs="Malgun Gothic"/>
+        <w:rFonts w:ascii="맑은 고딕" w:eastAsia="맑은 고딕" w:hAnsi="맑은 고딕" w:cs="맑은 고딕"/>
         <w:sz w:val="17"/>
         <w:szCs w:val="17"/>
         <w:lang w:val="en-US" w:eastAsia="ko-KR" w:bidi="ar-SA"/>

</xml_diff>